<commit_message>
Cuarto cambio: Documento word y PDF finalizado para la entrega
</commit_message>
<xml_diff>
--- a/Informe Desarrollo De Sistemas Informáticos.docx
+++ b/Informe Desarrollo De Sistemas Informáticos.docx
@@ -222,8 +222,33 @@
           <w:sz w:val="44"/>
           <w:szCs w:val="44"/>
         </w:rPr>
-        <w:t>1</w:t>
-      </w:r>
+        <w:t>1.</w:t>
+      </w:r>
+      <w:r>
+        <w:rPr>
+          <w:rFonts w:ascii="Times New Roman" w:hAnsi="Times New Roman" w:cs="Times New Roman"/>
+          <w:sz w:val="44"/>
+          <w:szCs w:val="44"/>
+        </w:rPr>
+        <w:t xml:space="preserve"> </w:t>
+      </w:r>
+      <w:r>
+        <w:rPr>
+          <w:rFonts w:ascii="Times New Roman" w:hAnsi="Times New Roman" w:cs="Times New Roman"/>
+          <w:sz w:val="44"/>
+          <w:szCs w:val="44"/>
+        </w:rPr>
+        <w:t>Estudio de Caso - Sistema de Control de Rescate y Adopción Animal</w:t>
+      </w:r>
+    </w:p>
+    <w:p>
+      <w:pPr>
+        <w:rPr>
+          <w:rFonts w:ascii="Times New Roman" w:hAnsi="Times New Roman" w:cs="Times New Roman"/>
+          <w:sz w:val="44"/>
+          <w:szCs w:val="44"/>
+        </w:rPr>
+      </w:pPr>
       <w:r>
         <w:rPr>
           <w:rFonts w:ascii="Times New Roman" w:hAnsi="Times New Roman" w:cs="Times New Roman"/>
@@ -232,7 +257,7 @@
           <w:sz w:val="44"/>
           <w:szCs w:val="44"/>
         </w:rPr>
-        <w:t>.</w:t>
+        <w:t>Nombre:</w:t>
       </w:r>
       <w:r>
         <w:rPr>
@@ -240,25 +265,8 @@
           <w:sz w:val="44"/>
           <w:szCs w:val="44"/>
         </w:rPr>
-        <w:t xml:space="preserve"> </w:t>
-      </w:r>
-      <w:r>
-        <w:rPr>
-          <w:rFonts w:ascii="Times New Roman" w:hAnsi="Times New Roman" w:cs="Times New Roman"/>
-          <w:sz w:val="44"/>
-          <w:szCs w:val="44"/>
-        </w:rPr>
-        <w:t>Estudio de Caso - Sistema de Control de Rescate y Adopción Animal</w:t>
-      </w:r>
-    </w:p>
-    <w:p>
-      <w:pPr>
-        <w:rPr>
-          <w:rFonts w:ascii="Times New Roman" w:hAnsi="Times New Roman" w:cs="Times New Roman"/>
-          <w:sz w:val="44"/>
-          <w:szCs w:val="44"/>
-        </w:rPr>
-      </w:pPr>
+        <w:t xml:space="preserve"> Jorge Luis Camacho Pinargote </w:t>
+      </w:r>
       <w:r>
         <w:rPr>
           <w:rFonts w:ascii="Times New Roman" w:hAnsi="Times New Roman" w:cs="Times New Roman"/>
@@ -267,7 +275,7 @@
           <w:sz w:val="44"/>
           <w:szCs w:val="44"/>
         </w:rPr>
-        <w:t>Nombre:</w:t>
+        <w:t>Paralelo:</w:t>
       </w:r>
       <w:r>
         <w:rPr>
@@ -275,8 +283,18 @@
           <w:sz w:val="44"/>
           <w:szCs w:val="44"/>
         </w:rPr>
-        <w:t xml:space="preserve"> Jorge Luis Camacho Pinargote </w:t>
-      </w:r>
+        <w:t xml:space="preserve"> A</w:t>
+      </w:r>
+    </w:p>
+    <w:p>
+      <w:pPr>
+        <w:jc w:val="both"/>
+        <w:rPr>
+          <w:rFonts w:ascii="Times New Roman" w:hAnsi="Times New Roman" w:cs="Times New Roman"/>
+          <w:sz w:val="44"/>
+          <w:szCs w:val="44"/>
+        </w:rPr>
+      </w:pPr>
       <w:r>
         <w:rPr>
           <w:rFonts w:ascii="Times New Roman" w:hAnsi="Times New Roman" w:cs="Times New Roman"/>
@@ -285,26 +303,8 @@
           <w:sz w:val="44"/>
           <w:szCs w:val="44"/>
         </w:rPr>
-        <w:t>Paralelo:</w:t>
-      </w:r>
-      <w:r>
-        <w:rPr>
-          <w:rFonts w:ascii="Times New Roman" w:hAnsi="Times New Roman" w:cs="Times New Roman"/>
-          <w:sz w:val="44"/>
-          <w:szCs w:val="44"/>
-        </w:rPr>
-        <w:t xml:space="preserve"> A</w:t>
-      </w:r>
-    </w:p>
-    <w:p>
-      <w:pPr>
-        <w:jc w:val="both"/>
-        <w:rPr>
-          <w:rFonts w:ascii="Times New Roman" w:hAnsi="Times New Roman" w:cs="Times New Roman"/>
-          <w:sz w:val="44"/>
-          <w:szCs w:val="44"/>
-        </w:rPr>
-      </w:pPr>
+        <w:t>Tutor:</w:t>
+      </w:r>
       <w:r>
         <w:rPr>
           <w:rFonts w:ascii="Times New Roman" w:hAnsi="Times New Roman" w:cs="Times New Roman"/>
@@ -313,16 +313,6 @@
           <w:sz w:val="44"/>
           <w:szCs w:val="44"/>
         </w:rPr>
-        <w:t>Tutor:</w:t>
-      </w:r>
-      <w:r>
-        <w:rPr>
-          <w:rFonts w:ascii="Times New Roman" w:hAnsi="Times New Roman" w:cs="Times New Roman"/>
-          <w:b/>
-          <w:bCs/>
-          <w:sz w:val="44"/>
-          <w:szCs w:val="44"/>
-        </w:rPr>
         <w:t xml:space="preserve"> </w:t>
       </w:r>
       <w:r>
@@ -397,35 +387,26 @@
       <w:pPr>
         <w:pStyle w:val="NormalWeb"/>
         <w:rPr>
-          <w:rStyle w:val="CdigoHTML"/>
-          <w:sz w:val="24"/>
-          <w:szCs w:val="24"/>
-        </w:rPr>
-      </w:pPr>
-      <w:r>
-        <w:rPr>
-          <w:rFonts w:hAnsi="Symbol"/>
-          <w:sz w:val="36"/>
-          <w:szCs w:val="36"/>
-        </w:rPr>
-        <w:t></w:t>
-      </w:r>
-      <w:r>
-        <w:rPr>
-          <w:sz w:val="36"/>
-          <w:szCs w:val="36"/>
-        </w:rPr>
-        <w:t xml:space="preserve"> </w:t>
-      </w:r>
-      <w:proofErr w:type="gramStart"/>
-      <w:r>
-        <w:rPr>
           <w:b/>
           <w:bCs/>
           <w:sz w:val="36"/>
           <w:szCs w:val="36"/>
         </w:rPr>
-        <w:t xml:space="preserve">Enlace </w:t>
+      </w:pPr>
+      <w:r>
+        <w:rPr>
+          <w:rFonts w:hAnsi="Symbol"/>
+          <w:sz w:val="36"/>
+          <w:szCs w:val="36"/>
+        </w:rPr>
+        <w:t></w:t>
+      </w:r>
+      <w:r>
+        <w:rPr>
+          <w:sz w:val="36"/>
+          <w:szCs w:val="36"/>
+        </w:rPr>
+        <w:t xml:space="preserve"> </w:t>
       </w:r>
       <w:r>
         <w:rPr>
@@ -434,30 +415,2247 @@
           <w:sz w:val="36"/>
           <w:szCs w:val="36"/>
         </w:rPr>
+        <w:t>Enlace</w:t>
+      </w:r>
+      <w:r>
+        <w:rPr>
+          <w:b/>
+          <w:bCs/>
+          <w:sz w:val="36"/>
+          <w:szCs w:val="36"/>
+        </w:rPr>
+        <w:t xml:space="preserve"> al </w:t>
+      </w:r>
+      <w:proofErr w:type="spellStart"/>
+      <w:r>
+        <w:rPr>
+          <w:b/>
+          <w:bCs/>
+          <w:sz w:val="36"/>
+          <w:szCs w:val="36"/>
+        </w:rPr>
+        <w:t>github</w:t>
+      </w:r>
+      <w:proofErr w:type="spellEnd"/>
+      <w:r>
+        <w:rPr>
+          <w:b/>
+          <w:bCs/>
+          <w:sz w:val="36"/>
+          <w:szCs w:val="36"/>
+        </w:rPr>
         <w:t>:</w:t>
       </w:r>
-      <w:proofErr w:type="gramEnd"/>
+      <w:r>
+        <w:rPr>
+          <w:b/>
+          <w:bCs/>
+          <w:sz w:val="36"/>
+          <w:szCs w:val="36"/>
+        </w:rPr>
+        <w:t xml:space="preserve">  </w:t>
+      </w:r>
+    </w:p>
+    <w:p>
+      <w:pPr>
+        <w:pStyle w:val="NormalWeb"/>
+        <w:rPr>
+          <w:rStyle w:val="CdigoHTML"/>
+          <w:sz w:val="24"/>
+          <w:szCs w:val="24"/>
+        </w:rPr>
+      </w:pPr>
+      <w:hyperlink r:id="rId8" w:history="1">
+        <w:r>
+          <w:rPr>
+            <w:rStyle w:val="Hipervnculo"/>
+            <w:rFonts w:ascii="Courier New" w:hAnsi="Courier New" w:cs="Courier New"/>
+          </w:rPr>
+          <w:t>https://github.com/jcamacho4852/Actividad1-Rescate-y-Adopci-n-Animal</w:t>
+        </w:r>
+      </w:hyperlink>
+    </w:p>
+    <w:p>
+      <w:pPr>
+        <w:pStyle w:val="NormalWeb"/>
+        <w:rPr>
+          <w:rStyle w:val="CdigoHTML"/>
+          <w:sz w:val="24"/>
+          <w:szCs w:val="24"/>
+        </w:rPr>
+      </w:pPr>
     </w:p>
     <w:p>
       <w:r>
         <w:br w:type="page"/>
       </w:r>
     </w:p>
-    <w:p>
+    <w:sdt>
+      <w:sdtPr>
+        <w:rPr>
+          <w:rFonts w:ascii="Times New Roman" w:hAnsi="Times New Roman" w:cs="Times New Roman"/>
+          <w:lang w:val="es-ES"/>
+        </w:rPr>
+        <w:id w:val="2118721852"/>
+        <w:docPartObj>
+          <w:docPartGallery w:val="Table of Contents"/>
+          <w:docPartUnique/>
+        </w:docPartObj>
+      </w:sdtPr>
+      <w:sdtEndPr>
+        <w:rPr>
+          <w:rFonts w:eastAsiaTheme="minorHAnsi"/>
+          <w:b/>
+          <w:bCs/>
+          <w:color w:val="auto"/>
+          <w:sz w:val="22"/>
+          <w:szCs w:val="22"/>
+          <w:lang w:eastAsia="en-US"/>
+        </w:rPr>
+      </w:sdtEndPr>
+      <w:sdtContent>
+        <w:p>
+          <w:pPr>
+            <w:pStyle w:val="TtuloTDC"/>
+            <w:rPr>
+              <w:rFonts w:ascii="Times New Roman" w:hAnsi="Times New Roman" w:cs="Times New Roman"/>
+              <w:sz w:val="36"/>
+              <w:szCs w:val="36"/>
+            </w:rPr>
+          </w:pPr>
+          <w:r>
+            <w:rPr>
+              <w:rFonts w:ascii="Times New Roman" w:hAnsi="Times New Roman" w:cs="Times New Roman"/>
+              <w:color w:val="auto"/>
+              <w:sz w:val="36"/>
+              <w:szCs w:val="36"/>
+              <w:lang w:val="es-ES"/>
+            </w:rPr>
+            <w:t>Índice</w:t>
+          </w:r>
+          <w:r>
+            <w:rPr>
+              <w:rFonts w:ascii="Times New Roman" w:hAnsi="Times New Roman" w:cs="Times New Roman"/>
+              <w:sz w:val="36"/>
+              <w:szCs w:val="36"/>
+              <w:lang w:val="es-ES"/>
+            </w:rPr>
+            <w:t xml:space="preserve"> </w:t>
+          </w:r>
+        </w:p>
+        <w:p>
+          <w:pPr>
+            <w:pStyle w:val="TDC2"/>
+            <w:tabs>
+              <w:tab w:val="right" w:leader="dot" w:pos="8494"/>
+            </w:tabs>
+            <w:rPr>
+              <w:rFonts w:ascii="Times New Roman" w:hAnsi="Times New Roman" w:cs="Times New Roman"/>
+              <w:noProof/>
+              <w:sz w:val="24"/>
+              <w:szCs w:val="24"/>
+            </w:rPr>
+          </w:pPr>
+          <w:r>
+            <w:rPr>
+              <w:rFonts w:ascii="Times New Roman" w:hAnsi="Times New Roman" w:cs="Times New Roman"/>
+              <w:sz w:val="24"/>
+              <w:szCs w:val="24"/>
+            </w:rPr>
+            <w:fldChar w:fldCharType="begin"/>
+          </w:r>
+          <w:r>
+            <w:rPr>
+              <w:rFonts w:ascii="Times New Roman" w:hAnsi="Times New Roman" w:cs="Times New Roman"/>
+              <w:sz w:val="24"/>
+              <w:szCs w:val="24"/>
+            </w:rPr>
+            <w:instrText xml:space="preserve"> TOC \o "1-3" \h \z \u </w:instrText>
+          </w:r>
+          <w:r>
+            <w:rPr>
+              <w:rFonts w:ascii="Times New Roman" w:hAnsi="Times New Roman" w:cs="Times New Roman"/>
+              <w:sz w:val="24"/>
+              <w:szCs w:val="24"/>
+            </w:rPr>
+            <w:fldChar w:fldCharType="separate"/>
+          </w:r>
+          <w:hyperlink w:anchor="_Toc242871867" w:history="1">
+            <w:r>
+              <w:rPr>
+                <w:rStyle w:val="Hipervnculo"/>
+                <w:rFonts w:ascii="Times New Roman" w:hAnsi="Times New Roman" w:cs="Times New Roman"/>
+                <w:noProof/>
+                <w:sz w:val="24"/>
+                <w:szCs w:val="24"/>
+              </w:rPr>
+              <w:t>1. Introducción y Descripción del Escenario</w:t>
+            </w:r>
+            <w:r>
+              <w:rPr>
+                <w:rFonts w:ascii="Times New Roman" w:hAnsi="Times New Roman" w:cs="Times New Roman"/>
+                <w:noProof/>
+                <w:webHidden/>
+                <w:sz w:val="24"/>
+                <w:szCs w:val="24"/>
+              </w:rPr>
+              <w:tab/>
+            </w:r>
+            <w:r>
+              <w:rPr>
+                <w:rFonts w:ascii="Times New Roman" w:hAnsi="Times New Roman" w:cs="Times New Roman"/>
+                <w:noProof/>
+                <w:webHidden/>
+                <w:sz w:val="24"/>
+                <w:szCs w:val="24"/>
+              </w:rPr>
+              <w:fldChar w:fldCharType="begin"/>
+            </w:r>
+            <w:r>
+              <w:rPr>
+                <w:rFonts w:ascii="Times New Roman" w:hAnsi="Times New Roman" w:cs="Times New Roman"/>
+                <w:noProof/>
+                <w:webHidden/>
+                <w:sz w:val="24"/>
+                <w:szCs w:val="24"/>
+              </w:rPr>
+              <w:instrText xml:space="preserve"> PAGEREF _Toc242871867 \h </w:instrText>
+            </w:r>
+            <w:r>
+              <w:rPr>
+                <w:rFonts w:ascii="Times New Roman" w:hAnsi="Times New Roman" w:cs="Times New Roman"/>
+                <w:noProof/>
+                <w:webHidden/>
+                <w:sz w:val="24"/>
+                <w:szCs w:val="24"/>
+              </w:rPr>
+            </w:r>
+            <w:r>
+              <w:rPr>
+                <w:rFonts w:ascii="Times New Roman" w:hAnsi="Times New Roman" w:cs="Times New Roman"/>
+                <w:noProof/>
+                <w:webHidden/>
+                <w:sz w:val="24"/>
+                <w:szCs w:val="24"/>
+              </w:rPr>
+              <w:fldChar w:fldCharType="separate"/>
+            </w:r>
+            <w:r>
+              <w:rPr>
+                <w:rFonts w:ascii="Times New Roman" w:hAnsi="Times New Roman" w:cs="Times New Roman"/>
+                <w:noProof/>
+                <w:webHidden/>
+                <w:sz w:val="24"/>
+                <w:szCs w:val="24"/>
+              </w:rPr>
+              <w:t>3</w:t>
+            </w:r>
+            <w:r>
+              <w:rPr>
+                <w:rFonts w:ascii="Times New Roman" w:hAnsi="Times New Roman" w:cs="Times New Roman"/>
+                <w:noProof/>
+                <w:webHidden/>
+                <w:sz w:val="24"/>
+                <w:szCs w:val="24"/>
+              </w:rPr>
+              <w:fldChar w:fldCharType="end"/>
+            </w:r>
+          </w:hyperlink>
+        </w:p>
+        <w:p>
+          <w:pPr>
+            <w:pStyle w:val="TDC2"/>
+            <w:tabs>
+              <w:tab w:val="right" w:leader="dot" w:pos="8494"/>
+            </w:tabs>
+            <w:rPr>
+              <w:rFonts w:ascii="Times New Roman" w:hAnsi="Times New Roman" w:cs="Times New Roman"/>
+              <w:noProof/>
+              <w:sz w:val="24"/>
+              <w:szCs w:val="24"/>
+            </w:rPr>
+          </w:pPr>
+          <w:hyperlink w:anchor="_Toc242871868" w:history="1">
+            <w:r>
+              <w:rPr>
+                <w:rStyle w:val="Hipervnculo"/>
+                <w:rFonts w:ascii="Times New Roman" w:hAnsi="Times New Roman" w:cs="Times New Roman"/>
+                <w:noProof/>
+                <w:sz w:val="24"/>
+                <w:szCs w:val="24"/>
+              </w:rPr>
+              <w:t>2. Análisis de Requerimientos</w:t>
+            </w:r>
+            <w:r>
+              <w:rPr>
+                <w:rFonts w:ascii="Times New Roman" w:hAnsi="Times New Roman" w:cs="Times New Roman"/>
+                <w:noProof/>
+                <w:webHidden/>
+                <w:sz w:val="24"/>
+                <w:szCs w:val="24"/>
+              </w:rPr>
+              <w:tab/>
+            </w:r>
+            <w:r>
+              <w:rPr>
+                <w:rFonts w:ascii="Times New Roman" w:hAnsi="Times New Roman" w:cs="Times New Roman"/>
+                <w:noProof/>
+                <w:webHidden/>
+                <w:sz w:val="24"/>
+                <w:szCs w:val="24"/>
+              </w:rPr>
+              <w:fldChar w:fldCharType="begin"/>
+            </w:r>
+            <w:r>
+              <w:rPr>
+                <w:rFonts w:ascii="Times New Roman" w:hAnsi="Times New Roman" w:cs="Times New Roman"/>
+                <w:noProof/>
+                <w:webHidden/>
+                <w:sz w:val="24"/>
+                <w:szCs w:val="24"/>
+              </w:rPr>
+              <w:instrText xml:space="preserve"> PAGEREF _Toc242871868 \h </w:instrText>
+            </w:r>
+            <w:r>
+              <w:rPr>
+                <w:rFonts w:ascii="Times New Roman" w:hAnsi="Times New Roman" w:cs="Times New Roman"/>
+                <w:noProof/>
+                <w:webHidden/>
+                <w:sz w:val="24"/>
+                <w:szCs w:val="24"/>
+              </w:rPr>
+            </w:r>
+            <w:r>
+              <w:rPr>
+                <w:rFonts w:ascii="Times New Roman" w:hAnsi="Times New Roman" w:cs="Times New Roman"/>
+                <w:noProof/>
+                <w:webHidden/>
+                <w:sz w:val="24"/>
+                <w:szCs w:val="24"/>
+              </w:rPr>
+              <w:fldChar w:fldCharType="separate"/>
+            </w:r>
+            <w:r>
+              <w:rPr>
+                <w:rFonts w:ascii="Times New Roman" w:hAnsi="Times New Roman" w:cs="Times New Roman"/>
+                <w:noProof/>
+                <w:webHidden/>
+                <w:sz w:val="24"/>
+                <w:szCs w:val="24"/>
+              </w:rPr>
+              <w:t>3</w:t>
+            </w:r>
+            <w:r>
+              <w:rPr>
+                <w:rFonts w:ascii="Times New Roman" w:hAnsi="Times New Roman" w:cs="Times New Roman"/>
+                <w:noProof/>
+                <w:webHidden/>
+                <w:sz w:val="24"/>
+                <w:szCs w:val="24"/>
+              </w:rPr>
+              <w:fldChar w:fldCharType="end"/>
+            </w:r>
+          </w:hyperlink>
+        </w:p>
+        <w:p>
+          <w:pPr>
+            <w:pStyle w:val="TDC3"/>
+            <w:tabs>
+              <w:tab w:val="right" w:leader="dot" w:pos="8494"/>
+            </w:tabs>
+            <w:rPr>
+              <w:rFonts w:ascii="Times New Roman" w:hAnsi="Times New Roman" w:cs="Times New Roman"/>
+              <w:noProof/>
+              <w:sz w:val="24"/>
+              <w:szCs w:val="24"/>
+            </w:rPr>
+          </w:pPr>
+          <w:hyperlink w:anchor="_Toc242871869" w:history="1">
+            <w:r>
+              <w:rPr>
+                <w:rStyle w:val="Hipervnculo"/>
+                <w:rFonts w:ascii="Times New Roman" w:hAnsi="Times New Roman" w:cs="Times New Roman"/>
+                <w:noProof/>
+                <w:sz w:val="24"/>
+                <w:szCs w:val="24"/>
+              </w:rPr>
+              <w:t>2.1. Identificación de Actores</w:t>
+            </w:r>
+            <w:r>
+              <w:rPr>
+                <w:rFonts w:ascii="Times New Roman" w:hAnsi="Times New Roman" w:cs="Times New Roman"/>
+                <w:noProof/>
+                <w:webHidden/>
+                <w:sz w:val="24"/>
+                <w:szCs w:val="24"/>
+              </w:rPr>
+              <w:tab/>
+            </w:r>
+            <w:r>
+              <w:rPr>
+                <w:rFonts w:ascii="Times New Roman" w:hAnsi="Times New Roman" w:cs="Times New Roman"/>
+                <w:noProof/>
+                <w:webHidden/>
+                <w:sz w:val="24"/>
+                <w:szCs w:val="24"/>
+              </w:rPr>
+              <w:fldChar w:fldCharType="begin"/>
+            </w:r>
+            <w:r>
+              <w:rPr>
+                <w:rFonts w:ascii="Times New Roman" w:hAnsi="Times New Roman" w:cs="Times New Roman"/>
+                <w:noProof/>
+                <w:webHidden/>
+                <w:sz w:val="24"/>
+                <w:szCs w:val="24"/>
+              </w:rPr>
+              <w:instrText xml:space="preserve"> PAGEREF _Toc242871869 \h </w:instrText>
+            </w:r>
+            <w:r>
+              <w:rPr>
+                <w:rFonts w:ascii="Times New Roman" w:hAnsi="Times New Roman" w:cs="Times New Roman"/>
+                <w:noProof/>
+                <w:webHidden/>
+                <w:sz w:val="24"/>
+                <w:szCs w:val="24"/>
+              </w:rPr>
+            </w:r>
+            <w:r>
+              <w:rPr>
+                <w:rFonts w:ascii="Times New Roman" w:hAnsi="Times New Roman" w:cs="Times New Roman"/>
+                <w:noProof/>
+                <w:webHidden/>
+                <w:sz w:val="24"/>
+                <w:szCs w:val="24"/>
+              </w:rPr>
+              <w:fldChar w:fldCharType="separate"/>
+            </w:r>
+            <w:r>
+              <w:rPr>
+                <w:rFonts w:ascii="Times New Roman" w:hAnsi="Times New Roman" w:cs="Times New Roman"/>
+                <w:noProof/>
+                <w:webHidden/>
+                <w:sz w:val="24"/>
+                <w:szCs w:val="24"/>
+              </w:rPr>
+              <w:t>3</w:t>
+            </w:r>
+            <w:r>
+              <w:rPr>
+                <w:rFonts w:ascii="Times New Roman" w:hAnsi="Times New Roman" w:cs="Times New Roman"/>
+                <w:noProof/>
+                <w:webHidden/>
+                <w:sz w:val="24"/>
+                <w:szCs w:val="24"/>
+              </w:rPr>
+              <w:fldChar w:fldCharType="end"/>
+            </w:r>
+          </w:hyperlink>
+        </w:p>
+        <w:p>
+          <w:pPr>
+            <w:pStyle w:val="TDC3"/>
+            <w:tabs>
+              <w:tab w:val="right" w:leader="dot" w:pos="8494"/>
+            </w:tabs>
+            <w:rPr>
+              <w:rFonts w:ascii="Times New Roman" w:hAnsi="Times New Roman" w:cs="Times New Roman"/>
+              <w:noProof/>
+              <w:sz w:val="24"/>
+              <w:szCs w:val="24"/>
+            </w:rPr>
+          </w:pPr>
+          <w:hyperlink w:anchor="_Toc242871870" w:history="1">
+            <w:r>
+              <w:rPr>
+                <w:rStyle w:val="Hipervnculo"/>
+                <w:rFonts w:ascii="Times New Roman" w:hAnsi="Times New Roman" w:cs="Times New Roman"/>
+                <w:noProof/>
+                <w:sz w:val="24"/>
+                <w:szCs w:val="24"/>
+              </w:rPr>
+              <w:t>2.2. Requerimientos Funcionales</w:t>
+            </w:r>
+            <w:r>
+              <w:rPr>
+                <w:rFonts w:ascii="Times New Roman" w:hAnsi="Times New Roman" w:cs="Times New Roman"/>
+                <w:noProof/>
+                <w:webHidden/>
+                <w:sz w:val="24"/>
+                <w:szCs w:val="24"/>
+              </w:rPr>
+              <w:tab/>
+            </w:r>
+            <w:r>
+              <w:rPr>
+                <w:rFonts w:ascii="Times New Roman" w:hAnsi="Times New Roman" w:cs="Times New Roman"/>
+                <w:noProof/>
+                <w:webHidden/>
+                <w:sz w:val="24"/>
+                <w:szCs w:val="24"/>
+              </w:rPr>
+              <w:fldChar w:fldCharType="begin"/>
+            </w:r>
+            <w:r>
+              <w:rPr>
+                <w:rFonts w:ascii="Times New Roman" w:hAnsi="Times New Roman" w:cs="Times New Roman"/>
+                <w:noProof/>
+                <w:webHidden/>
+                <w:sz w:val="24"/>
+                <w:szCs w:val="24"/>
+              </w:rPr>
+              <w:instrText xml:space="preserve"> PAGEREF _Toc242871870 \h </w:instrText>
+            </w:r>
+            <w:r>
+              <w:rPr>
+                <w:rFonts w:ascii="Times New Roman" w:hAnsi="Times New Roman" w:cs="Times New Roman"/>
+                <w:noProof/>
+                <w:webHidden/>
+                <w:sz w:val="24"/>
+                <w:szCs w:val="24"/>
+              </w:rPr>
+            </w:r>
+            <w:r>
+              <w:rPr>
+                <w:rFonts w:ascii="Times New Roman" w:hAnsi="Times New Roman" w:cs="Times New Roman"/>
+                <w:noProof/>
+                <w:webHidden/>
+                <w:sz w:val="24"/>
+                <w:szCs w:val="24"/>
+              </w:rPr>
+              <w:fldChar w:fldCharType="separate"/>
+            </w:r>
+            <w:r>
+              <w:rPr>
+                <w:rFonts w:ascii="Times New Roman" w:hAnsi="Times New Roman" w:cs="Times New Roman"/>
+                <w:noProof/>
+                <w:webHidden/>
+                <w:sz w:val="24"/>
+                <w:szCs w:val="24"/>
+              </w:rPr>
+              <w:t>3</w:t>
+            </w:r>
+            <w:r>
+              <w:rPr>
+                <w:rFonts w:ascii="Times New Roman" w:hAnsi="Times New Roman" w:cs="Times New Roman"/>
+                <w:noProof/>
+                <w:webHidden/>
+                <w:sz w:val="24"/>
+                <w:szCs w:val="24"/>
+              </w:rPr>
+              <w:fldChar w:fldCharType="end"/>
+            </w:r>
+          </w:hyperlink>
+        </w:p>
+        <w:p>
+          <w:pPr>
+            <w:pStyle w:val="TDC3"/>
+            <w:tabs>
+              <w:tab w:val="right" w:leader="dot" w:pos="8494"/>
+            </w:tabs>
+            <w:rPr>
+              <w:rFonts w:ascii="Times New Roman" w:hAnsi="Times New Roman" w:cs="Times New Roman"/>
+              <w:noProof/>
+              <w:sz w:val="24"/>
+              <w:szCs w:val="24"/>
+            </w:rPr>
+          </w:pPr>
+          <w:hyperlink w:anchor="_Toc242871871" w:history="1">
+            <w:r>
+              <w:rPr>
+                <w:rStyle w:val="Hipervnculo"/>
+                <w:rFonts w:ascii="Times New Roman" w:hAnsi="Times New Roman" w:cs="Times New Roman"/>
+                <w:noProof/>
+                <w:sz w:val="24"/>
+                <w:szCs w:val="24"/>
+              </w:rPr>
+              <w:t>2.3. Requerimientos No Funcionales</w:t>
+            </w:r>
+            <w:r>
+              <w:rPr>
+                <w:rFonts w:ascii="Times New Roman" w:hAnsi="Times New Roman" w:cs="Times New Roman"/>
+                <w:noProof/>
+                <w:webHidden/>
+                <w:sz w:val="24"/>
+                <w:szCs w:val="24"/>
+              </w:rPr>
+              <w:tab/>
+            </w:r>
+            <w:r>
+              <w:rPr>
+                <w:rFonts w:ascii="Times New Roman" w:hAnsi="Times New Roman" w:cs="Times New Roman"/>
+                <w:noProof/>
+                <w:webHidden/>
+                <w:sz w:val="24"/>
+                <w:szCs w:val="24"/>
+              </w:rPr>
+              <w:fldChar w:fldCharType="begin"/>
+            </w:r>
+            <w:r>
+              <w:rPr>
+                <w:rFonts w:ascii="Times New Roman" w:hAnsi="Times New Roman" w:cs="Times New Roman"/>
+                <w:noProof/>
+                <w:webHidden/>
+                <w:sz w:val="24"/>
+                <w:szCs w:val="24"/>
+              </w:rPr>
+              <w:instrText xml:space="preserve"> PAGEREF _Toc242871871 \h </w:instrText>
+            </w:r>
+            <w:r>
+              <w:rPr>
+                <w:rFonts w:ascii="Times New Roman" w:hAnsi="Times New Roman" w:cs="Times New Roman"/>
+                <w:noProof/>
+                <w:webHidden/>
+                <w:sz w:val="24"/>
+                <w:szCs w:val="24"/>
+              </w:rPr>
+            </w:r>
+            <w:r>
+              <w:rPr>
+                <w:rFonts w:ascii="Times New Roman" w:hAnsi="Times New Roman" w:cs="Times New Roman"/>
+                <w:noProof/>
+                <w:webHidden/>
+                <w:sz w:val="24"/>
+                <w:szCs w:val="24"/>
+              </w:rPr>
+              <w:fldChar w:fldCharType="separate"/>
+            </w:r>
+            <w:r>
+              <w:rPr>
+                <w:rFonts w:ascii="Times New Roman" w:hAnsi="Times New Roman" w:cs="Times New Roman"/>
+                <w:noProof/>
+                <w:webHidden/>
+                <w:sz w:val="24"/>
+                <w:szCs w:val="24"/>
+              </w:rPr>
+              <w:t>3</w:t>
+            </w:r>
+            <w:r>
+              <w:rPr>
+                <w:rFonts w:ascii="Times New Roman" w:hAnsi="Times New Roman" w:cs="Times New Roman"/>
+                <w:noProof/>
+                <w:webHidden/>
+                <w:sz w:val="24"/>
+                <w:szCs w:val="24"/>
+              </w:rPr>
+              <w:fldChar w:fldCharType="end"/>
+            </w:r>
+          </w:hyperlink>
+        </w:p>
+        <w:p>
+          <w:pPr>
+            <w:pStyle w:val="TDC2"/>
+            <w:tabs>
+              <w:tab w:val="right" w:leader="dot" w:pos="8494"/>
+            </w:tabs>
+            <w:rPr>
+              <w:rFonts w:ascii="Times New Roman" w:hAnsi="Times New Roman" w:cs="Times New Roman"/>
+              <w:noProof/>
+              <w:sz w:val="24"/>
+              <w:szCs w:val="24"/>
+            </w:rPr>
+          </w:pPr>
+          <w:hyperlink w:anchor="_Toc242871872" w:history="1">
+            <w:r>
+              <w:rPr>
+                <w:rStyle w:val="Hipervnculo"/>
+                <w:rFonts w:ascii="Times New Roman" w:hAnsi="Times New Roman" w:cs="Times New Roman"/>
+                <w:noProof/>
+                <w:sz w:val="24"/>
+                <w:szCs w:val="24"/>
+              </w:rPr>
+              <w:t>3. Modelado UML</w:t>
+            </w:r>
+            <w:r>
+              <w:rPr>
+                <w:rFonts w:ascii="Times New Roman" w:hAnsi="Times New Roman" w:cs="Times New Roman"/>
+                <w:noProof/>
+                <w:webHidden/>
+                <w:sz w:val="24"/>
+                <w:szCs w:val="24"/>
+              </w:rPr>
+              <w:tab/>
+            </w:r>
+            <w:r>
+              <w:rPr>
+                <w:rFonts w:ascii="Times New Roman" w:hAnsi="Times New Roman" w:cs="Times New Roman"/>
+                <w:noProof/>
+                <w:webHidden/>
+                <w:sz w:val="24"/>
+                <w:szCs w:val="24"/>
+              </w:rPr>
+              <w:fldChar w:fldCharType="begin"/>
+            </w:r>
+            <w:r>
+              <w:rPr>
+                <w:rFonts w:ascii="Times New Roman" w:hAnsi="Times New Roman" w:cs="Times New Roman"/>
+                <w:noProof/>
+                <w:webHidden/>
+                <w:sz w:val="24"/>
+                <w:szCs w:val="24"/>
+              </w:rPr>
+              <w:instrText xml:space="preserve"> PAGEREF _Toc242871872 \h </w:instrText>
+            </w:r>
+            <w:r>
+              <w:rPr>
+                <w:rFonts w:ascii="Times New Roman" w:hAnsi="Times New Roman" w:cs="Times New Roman"/>
+                <w:noProof/>
+                <w:webHidden/>
+                <w:sz w:val="24"/>
+                <w:szCs w:val="24"/>
+              </w:rPr>
+            </w:r>
+            <w:r>
+              <w:rPr>
+                <w:rFonts w:ascii="Times New Roman" w:hAnsi="Times New Roman" w:cs="Times New Roman"/>
+                <w:noProof/>
+                <w:webHidden/>
+                <w:sz w:val="24"/>
+                <w:szCs w:val="24"/>
+              </w:rPr>
+              <w:fldChar w:fldCharType="separate"/>
+            </w:r>
+            <w:r>
+              <w:rPr>
+                <w:rFonts w:ascii="Times New Roman" w:hAnsi="Times New Roman" w:cs="Times New Roman"/>
+                <w:noProof/>
+                <w:webHidden/>
+                <w:sz w:val="24"/>
+                <w:szCs w:val="24"/>
+              </w:rPr>
+              <w:t>4</w:t>
+            </w:r>
+            <w:r>
+              <w:rPr>
+                <w:rFonts w:ascii="Times New Roman" w:hAnsi="Times New Roman" w:cs="Times New Roman"/>
+                <w:noProof/>
+                <w:webHidden/>
+                <w:sz w:val="24"/>
+                <w:szCs w:val="24"/>
+              </w:rPr>
+              <w:fldChar w:fldCharType="end"/>
+            </w:r>
+          </w:hyperlink>
+        </w:p>
+        <w:p>
+          <w:pPr>
+            <w:pStyle w:val="TDC3"/>
+            <w:tabs>
+              <w:tab w:val="right" w:leader="dot" w:pos="8494"/>
+            </w:tabs>
+            <w:rPr>
+              <w:rFonts w:ascii="Times New Roman" w:hAnsi="Times New Roman" w:cs="Times New Roman"/>
+              <w:noProof/>
+              <w:sz w:val="24"/>
+              <w:szCs w:val="24"/>
+            </w:rPr>
+          </w:pPr>
+          <w:hyperlink w:anchor="_Toc242871873" w:history="1">
+            <w:r>
+              <w:rPr>
+                <w:rStyle w:val="Hipervnculo"/>
+                <w:rFonts w:ascii="Times New Roman" w:hAnsi="Times New Roman" w:cs="Times New Roman"/>
+                <w:noProof/>
+                <w:sz w:val="24"/>
+                <w:szCs w:val="24"/>
+              </w:rPr>
+              <w:t>3.1. Diagrama de Casos de Uso</w:t>
+            </w:r>
+            <w:r>
+              <w:rPr>
+                <w:rFonts w:ascii="Times New Roman" w:hAnsi="Times New Roman" w:cs="Times New Roman"/>
+                <w:noProof/>
+                <w:webHidden/>
+                <w:sz w:val="24"/>
+                <w:szCs w:val="24"/>
+              </w:rPr>
+              <w:tab/>
+            </w:r>
+            <w:r>
+              <w:rPr>
+                <w:rFonts w:ascii="Times New Roman" w:hAnsi="Times New Roman" w:cs="Times New Roman"/>
+                <w:noProof/>
+                <w:webHidden/>
+                <w:sz w:val="24"/>
+                <w:szCs w:val="24"/>
+              </w:rPr>
+              <w:fldChar w:fldCharType="begin"/>
+            </w:r>
+            <w:r>
+              <w:rPr>
+                <w:rFonts w:ascii="Times New Roman" w:hAnsi="Times New Roman" w:cs="Times New Roman"/>
+                <w:noProof/>
+                <w:webHidden/>
+                <w:sz w:val="24"/>
+                <w:szCs w:val="24"/>
+              </w:rPr>
+              <w:instrText xml:space="preserve"> PAGEREF _Toc242871873 \h </w:instrText>
+            </w:r>
+            <w:r>
+              <w:rPr>
+                <w:rFonts w:ascii="Times New Roman" w:hAnsi="Times New Roman" w:cs="Times New Roman"/>
+                <w:noProof/>
+                <w:webHidden/>
+                <w:sz w:val="24"/>
+                <w:szCs w:val="24"/>
+              </w:rPr>
+            </w:r>
+            <w:r>
+              <w:rPr>
+                <w:rFonts w:ascii="Times New Roman" w:hAnsi="Times New Roman" w:cs="Times New Roman"/>
+                <w:noProof/>
+                <w:webHidden/>
+                <w:sz w:val="24"/>
+                <w:szCs w:val="24"/>
+              </w:rPr>
+              <w:fldChar w:fldCharType="separate"/>
+            </w:r>
+            <w:r>
+              <w:rPr>
+                <w:rFonts w:ascii="Times New Roman" w:hAnsi="Times New Roman" w:cs="Times New Roman"/>
+                <w:noProof/>
+                <w:webHidden/>
+                <w:sz w:val="24"/>
+                <w:szCs w:val="24"/>
+              </w:rPr>
+              <w:t>4</w:t>
+            </w:r>
+            <w:r>
+              <w:rPr>
+                <w:rFonts w:ascii="Times New Roman" w:hAnsi="Times New Roman" w:cs="Times New Roman"/>
+                <w:noProof/>
+                <w:webHidden/>
+                <w:sz w:val="24"/>
+                <w:szCs w:val="24"/>
+              </w:rPr>
+              <w:fldChar w:fldCharType="end"/>
+            </w:r>
+          </w:hyperlink>
+        </w:p>
+        <w:p>
+          <w:pPr>
+            <w:pStyle w:val="TDC3"/>
+            <w:tabs>
+              <w:tab w:val="right" w:leader="dot" w:pos="8494"/>
+            </w:tabs>
+            <w:rPr>
+              <w:rFonts w:ascii="Times New Roman" w:hAnsi="Times New Roman" w:cs="Times New Roman"/>
+              <w:noProof/>
+              <w:sz w:val="24"/>
+              <w:szCs w:val="24"/>
+            </w:rPr>
+          </w:pPr>
+          <w:hyperlink w:anchor="_Toc242871874" w:history="1">
+            <w:r>
+              <w:rPr>
+                <w:rStyle w:val="Hipervnculo"/>
+                <w:rFonts w:ascii="Times New Roman" w:hAnsi="Times New Roman" w:cs="Times New Roman"/>
+                <w:noProof/>
+                <w:sz w:val="24"/>
+                <w:szCs w:val="24"/>
+              </w:rPr>
+              <w:t>3.2. Diagrama de Clases</w:t>
+            </w:r>
+            <w:r>
+              <w:rPr>
+                <w:rFonts w:ascii="Times New Roman" w:hAnsi="Times New Roman" w:cs="Times New Roman"/>
+                <w:noProof/>
+                <w:webHidden/>
+                <w:sz w:val="24"/>
+                <w:szCs w:val="24"/>
+              </w:rPr>
+              <w:tab/>
+            </w:r>
+            <w:r>
+              <w:rPr>
+                <w:rFonts w:ascii="Times New Roman" w:hAnsi="Times New Roman" w:cs="Times New Roman"/>
+                <w:noProof/>
+                <w:webHidden/>
+                <w:sz w:val="24"/>
+                <w:szCs w:val="24"/>
+              </w:rPr>
+              <w:fldChar w:fldCharType="begin"/>
+            </w:r>
+            <w:r>
+              <w:rPr>
+                <w:rFonts w:ascii="Times New Roman" w:hAnsi="Times New Roman" w:cs="Times New Roman"/>
+                <w:noProof/>
+                <w:webHidden/>
+                <w:sz w:val="24"/>
+                <w:szCs w:val="24"/>
+              </w:rPr>
+              <w:instrText xml:space="preserve"> PAGEREF _Toc242871874 \h </w:instrText>
+            </w:r>
+            <w:r>
+              <w:rPr>
+                <w:rFonts w:ascii="Times New Roman" w:hAnsi="Times New Roman" w:cs="Times New Roman"/>
+                <w:noProof/>
+                <w:webHidden/>
+                <w:sz w:val="24"/>
+                <w:szCs w:val="24"/>
+              </w:rPr>
+            </w:r>
+            <w:r>
+              <w:rPr>
+                <w:rFonts w:ascii="Times New Roman" w:hAnsi="Times New Roman" w:cs="Times New Roman"/>
+                <w:noProof/>
+                <w:webHidden/>
+                <w:sz w:val="24"/>
+                <w:szCs w:val="24"/>
+              </w:rPr>
+              <w:fldChar w:fldCharType="separate"/>
+            </w:r>
+            <w:r>
+              <w:rPr>
+                <w:rFonts w:ascii="Times New Roman" w:hAnsi="Times New Roman" w:cs="Times New Roman"/>
+                <w:noProof/>
+                <w:webHidden/>
+                <w:sz w:val="24"/>
+                <w:szCs w:val="24"/>
+              </w:rPr>
+              <w:t>5</w:t>
+            </w:r>
+            <w:r>
+              <w:rPr>
+                <w:rFonts w:ascii="Times New Roman" w:hAnsi="Times New Roman" w:cs="Times New Roman"/>
+                <w:noProof/>
+                <w:webHidden/>
+                <w:sz w:val="24"/>
+                <w:szCs w:val="24"/>
+              </w:rPr>
+              <w:fldChar w:fldCharType="end"/>
+            </w:r>
+          </w:hyperlink>
+        </w:p>
+        <w:p>
+          <w:pPr>
+            <w:pStyle w:val="TDC2"/>
+            <w:tabs>
+              <w:tab w:val="right" w:leader="dot" w:pos="8494"/>
+            </w:tabs>
+            <w:rPr>
+              <w:rFonts w:ascii="Times New Roman" w:hAnsi="Times New Roman" w:cs="Times New Roman"/>
+              <w:noProof/>
+              <w:sz w:val="24"/>
+              <w:szCs w:val="24"/>
+            </w:rPr>
+          </w:pPr>
+          <w:hyperlink w:anchor="_Toc242871875" w:history="1">
+            <w:r>
+              <w:rPr>
+                <w:rStyle w:val="Hipervnculo"/>
+                <w:rFonts w:ascii="Times New Roman" w:hAnsi="Times New Roman" w:cs="Times New Roman"/>
+                <w:noProof/>
+                <w:sz w:val="24"/>
+                <w:szCs w:val="24"/>
+              </w:rPr>
+              <w:t>4. Implementación de Patrones de Diseño</w:t>
+            </w:r>
+            <w:r>
+              <w:rPr>
+                <w:rFonts w:ascii="Times New Roman" w:hAnsi="Times New Roman" w:cs="Times New Roman"/>
+                <w:noProof/>
+                <w:webHidden/>
+                <w:sz w:val="24"/>
+                <w:szCs w:val="24"/>
+              </w:rPr>
+              <w:tab/>
+            </w:r>
+            <w:r>
+              <w:rPr>
+                <w:rFonts w:ascii="Times New Roman" w:hAnsi="Times New Roman" w:cs="Times New Roman"/>
+                <w:noProof/>
+                <w:webHidden/>
+                <w:sz w:val="24"/>
+                <w:szCs w:val="24"/>
+              </w:rPr>
+              <w:fldChar w:fldCharType="begin"/>
+            </w:r>
+            <w:r>
+              <w:rPr>
+                <w:rFonts w:ascii="Times New Roman" w:hAnsi="Times New Roman" w:cs="Times New Roman"/>
+                <w:noProof/>
+                <w:webHidden/>
+                <w:sz w:val="24"/>
+                <w:szCs w:val="24"/>
+              </w:rPr>
+              <w:instrText xml:space="preserve"> PAGEREF _Toc242871875 \h </w:instrText>
+            </w:r>
+            <w:r>
+              <w:rPr>
+                <w:rFonts w:ascii="Times New Roman" w:hAnsi="Times New Roman" w:cs="Times New Roman"/>
+                <w:noProof/>
+                <w:webHidden/>
+                <w:sz w:val="24"/>
+                <w:szCs w:val="24"/>
+              </w:rPr>
+            </w:r>
+            <w:r>
+              <w:rPr>
+                <w:rFonts w:ascii="Times New Roman" w:hAnsi="Times New Roman" w:cs="Times New Roman"/>
+                <w:noProof/>
+                <w:webHidden/>
+                <w:sz w:val="24"/>
+                <w:szCs w:val="24"/>
+              </w:rPr>
+              <w:fldChar w:fldCharType="separate"/>
+            </w:r>
+            <w:r>
+              <w:rPr>
+                <w:rFonts w:ascii="Times New Roman" w:hAnsi="Times New Roman" w:cs="Times New Roman"/>
+                <w:noProof/>
+                <w:webHidden/>
+                <w:sz w:val="24"/>
+                <w:szCs w:val="24"/>
+              </w:rPr>
+              <w:t>6</w:t>
+            </w:r>
+            <w:r>
+              <w:rPr>
+                <w:rFonts w:ascii="Times New Roman" w:hAnsi="Times New Roman" w:cs="Times New Roman"/>
+                <w:noProof/>
+                <w:webHidden/>
+                <w:sz w:val="24"/>
+                <w:szCs w:val="24"/>
+              </w:rPr>
+              <w:fldChar w:fldCharType="end"/>
+            </w:r>
+          </w:hyperlink>
+        </w:p>
+        <w:p>
+          <w:pPr>
+            <w:pStyle w:val="TDC3"/>
+            <w:tabs>
+              <w:tab w:val="right" w:leader="dot" w:pos="8494"/>
+            </w:tabs>
+            <w:rPr>
+              <w:rFonts w:ascii="Times New Roman" w:hAnsi="Times New Roman" w:cs="Times New Roman"/>
+              <w:noProof/>
+              <w:sz w:val="24"/>
+              <w:szCs w:val="24"/>
+            </w:rPr>
+          </w:pPr>
+          <w:hyperlink w:anchor="_Toc242871876" w:history="1">
+            <w:r>
+              <w:rPr>
+                <w:rStyle w:val="Hipervnculo"/>
+                <w:rFonts w:ascii="Times New Roman" w:hAnsi="Times New Roman" w:cs="Times New Roman"/>
+                <w:noProof/>
+                <w:sz w:val="24"/>
+                <w:szCs w:val="24"/>
+              </w:rPr>
+              <w:t xml:space="preserve">4.1. Patrón Creacional: </w:t>
+            </w:r>
+            <w:r>
+              <w:rPr>
+                <w:rStyle w:val="Hipervnculo"/>
+                <w:rFonts w:ascii="Times New Roman" w:hAnsi="Times New Roman" w:cs="Times New Roman"/>
+                <w:i/>
+                <w:iCs/>
+                <w:noProof/>
+                <w:sz w:val="24"/>
+                <w:szCs w:val="24"/>
+              </w:rPr>
+              <w:t>Factory Method</w:t>
+            </w:r>
+            <w:r>
+              <w:rPr>
+                <w:rFonts w:ascii="Times New Roman" w:hAnsi="Times New Roman" w:cs="Times New Roman"/>
+                <w:noProof/>
+                <w:webHidden/>
+                <w:sz w:val="24"/>
+                <w:szCs w:val="24"/>
+              </w:rPr>
+              <w:tab/>
+            </w:r>
+            <w:r>
+              <w:rPr>
+                <w:rFonts w:ascii="Times New Roman" w:hAnsi="Times New Roman" w:cs="Times New Roman"/>
+                <w:noProof/>
+                <w:webHidden/>
+                <w:sz w:val="24"/>
+                <w:szCs w:val="24"/>
+              </w:rPr>
+              <w:fldChar w:fldCharType="begin"/>
+            </w:r>
+            <w:r>
+              <w:rPr>
+                <w:rFonts w:ascii="Times New Roman" w:hAnsi="Times New Roman" w:cs="Times New Roman"/>
+                <w:noProof/>
+                <w:webHidden/>
+                <w:sz w:val="24"/>
+                <w:szCs w:val="24"/>
+              </w:rPr>
+              <w:instrText xml:space="preserve"> PAGEREF _Toc242871876 \h </w:instrText>
+            </w:r>
+            <w:r>
+              <w:rPr>
+                <w:rFonts w:ascii="Times New Roman" w:hAnsi="Times New Roman" w:cs="Times New Roman"/>
+                <w:noProof/>
+                <w:webHidden/>
+                <w:sz w:val="24"/>
+                <w:szCs w:val="24"/>
+              </w:rPr>
+            </w:r>
+            <w:r>
+              <w:rPr>
+                <w:rFonts w:ascii="Times New Roman" w:hAnsi="Times New Roman" w:cs="Times New Roman"/>
+                <w:noProof/>
+                <w:webHidden/>
+                <w:sz w:val="24"/>
+                <w:szCs w:val="24"/>
+              </w:rPr>
+              <w:fldChar w:fldCharType="separate"/>
+            </w:r>
+            <w:r>
+              <w:rPr>
+                <w:rFonts w:ascii="Times New Roman" w:hAnsi="Times New Roman" w:cs="Times New Roman"/>
+                <w:noProof/>
+                <w:webHidden/>
+                <w:sz w:val="24"/>
+                <w:szCs w:val="24"/>
+              </w:rPr>
+              <w:t>6</w:t>
+            </w:r>
+            <w:r>
+              <w:rPr>
+                <w:rFonts w:ascii="Times New Roman" w:hAnsi="Times New Roman" w:cs="Times New Roman"/>
+                <w:noProof/>
+                <w:webHidden/>
+                <w:sz w:val="24"/>
+                <w:szCs w:val="24"/>
+              </w:rPr>
+              <w:fldChar w:fldCharType="end"/>
+            </w:r>
+          </w:hyperlink>
+        </w:p>
+        <w:p>
+          <w:pPr>
+            <w:pStyle w:val="TDC3"/>
+            <w:tabs>
+              <w:tab w:val="right" w:leader="dot" w:pos="8494"/>
+            </w:tabs>
+            <w:rPr>
+              <w:rFonts w:ascii="Times New Roman" w:hAnsi="Times New Roman" w:cs="Times New Roman"/>
+              <w:noProof/>
+              <w:sz w:val="24"/>
+              <w:szCs w:val="24"/>
+            </w:rPr>
+          </w:pPr>
+          <w:hyperlink w:anchor="_Toc242871877" w:history="1">
+            <w:r>
+              <w:rPr>
+                <w:rStyle w:val="Hipervnculo"/>
+                <w:rFonts w:ascii="Times New Roman" w:hAnsi="Times New Roman" w:cs="Times New Roman"/>
+                <w:noProof/>
+                <w:sz w:val="24"/>
+                <w:szCs w:val="24"/>
+              </w:rPr>
+              <w:t xml:space="preserve">4.2. Patrón Estructural: </w:t>
+            </w:r>
+            <w:r>
+              <w:rPr>
+                <w:rStyle w:val="Hipervnculo"/>
+                <w:rFonts w:ascii="Times New Roman" w:hAnsi="Times New Roman" w:cs="Times New Roman"/>
+                <w:i/>
+                <w:iCs/>
+                <w:noProof/>
+                <w:sz w:val="24"/>
+                <w:szCs w:val="24"/>
+              </w:rPr>
+              <w:t>Singleton</w:t>
+            </w:r>
+            <w:r>
+              <w:rPr>
+                <w:rFonts w:ascii="Times New Roman" w:hAnsi="Times New Roman" w:cs="Times New Roman"/>
+                <w:noProof/>
+                <w:webHidden/>
+                <w:sz w:val="24"/>
+                <w:szCs w:val="24"/>
+              </w:rPr>
+              <w:tab/>
+            </w:r>
+            <w:r>
+              <w:rPr>
+                <w:rFonts w:ascii="Times New Roman" w:hAnsi="Times New Roman" w:cs="Times New Roman"/>
+                <w:noProof/>
+                <w:webHidden/>
+                <w:sz w:val="24"/>
+                <w:szCs w:val="24"/>
+              </w:rPr>
+              <w:fldChar w:fldCharType="begin"/>
+            </w:r>
+            <w:r>
+              <w:rPr>
+                <w:rFonts w:ascii="Times New Roman" w:hAnsi="Times New Roman" w:cs="Times New Roman"/>
+                <w:noProof/>
+                <w:webHidden/>
+                <w:sz w:val="24"/>
+                <w:szCs w:val="24"/>
+              </w:rPr>
+              <w:instrText xml:space="preserve"> PAGEREF _Toc242871877 \h </w:instrText>
+            </w:r>
+            <w:r>
+              <w:rPr>
+                <w:rFonts w:ascii="Times New Roman" w:hAnsi="Times New Roman" w:cs="Times New Roman"/>
+                <w:noProof/>
+                <w:webHidden/>
+                <w:sz w:val="24"/>
+                <w:szCs w:val="24"/>
+              </w:rPr>
+            </w:r>
+            <w:r>
+              <w:rPr>
+                <w:rFonts w:ascii="Times New Roman" w:hAnsi="Times New Roman" w:cs="Times New Roman"/>
+                <w:noProof/>
+                <w:webHidden/>
+                <w:sz w:val="24"/>
+                <w:szCs w:val="24"/>
+              </w:rPr>
+              <w:fldChar w:fldCharType="separate"/>
+            </w:r>
+            <w:r>
+              <w:rPr>
+                <w:rFonts w:ascii="Times New Roman" w:hAnsi="Times New Roman" w:cs="Times New Roman"/>
+                <w:noProof/>
+                <w:webHidden/>
+                <w:sz w:val="24"/>
+                <w:szCs w:val="24"/>
+              </w:rPr>
+              <w:t>6</w:t>
+            </w:r>
+            <w:r>
+              <w:rPr>
+                <w:rFonts w:ascii="Times New Roman" w:hAnsi="Times New Roman" w:cs="Times New Roman"/>
+                <w:noProof/>
+                <w:webHidden/>
+                <w:sz w:val="24"/>
+                <w:szCs w:val="24"/>
+              </w:rPr>
+              <w:fldChar w:fldCharType="end"/>
+            </w:r>
+          </w:hyperlink>
+        </w:p>
+        <w:p>
+          <w:pPr>
+            <w:pStyle w:val="TDC3"/>
+            <w:tabs>
+              <w:tab w:val="right" w:leader="dot" w:pos="8494"/>
+            </w:tabs>
+            <w:rPr>
+              <w:rFonts w:ascii="Times New Roman" w:hAnsi="Times New Roman" w:cs="Times New Roman"/>
+              <w:noProof/>
+              <w:sz w:val="24"/>
+              <w:szCs w:val="24"/>
+            </w:rPr>
+          </w:pPr>
+          <w:hyperlink w:anchor="_Toc242871878" w:history="1">
+            <w:r>
+              <w:rPr>
+                <w:rStyle w:val="Hipervnculo"/>
+                <w:rFonts w:ascii="Times New Roman" w:hAnsi="Times New Roman" w:cs="Times New Roman"/>
+                <w:noProof/>
+                <w:sz w:val="24"/>
+                <w:szCs w:val="24"/>
+              </w:rPr>
+              <w:t xml:space="preserve">4.3. Patrón de Comportamiento: </w:t>
+            </w:r>
+            <w:r>
+              <w:rPr>
+                <w:rStyle w:val="Hipervnculo"/>
+                <w:rFonts w:ascii="Times New Roman" w:hAnsi="Times New Roman" w:cs="Times New Roman"/>
+                <w:i/>
+                <w:iCs/>
+                <w:noProof/>
+                <w:sz w:val="24"/>
+                <w:szCs w:val="24"/>
+              </w:rPr>
+              <w:t>Observer</w:t>
+            </w:r>
+            <w:r>
+              <w:rPr>
+                <w:rFonts w:ascii="Times New Roman" w:hAnsi="Times New Roman" w:cs="Times New Roman"/>
+                <w:noProof/>
+                <w:webHidden/>
+                <w:sz w:val="24"/>
+                <w:szCs w:val="24"/>
+              </w:rPr>
+              <w:tab/>
+            </w:r>
+            <w:r>
+              <w:rPr>
+                <w:rFonts w:ascii="Times New Roman" w:hAnsi="Times New Roman" w:cs="Times New Roman"/>
+                <w:noProof/>
+                <w:webHidden/>
+                <w:sz w:val="24"/>
+                <w:szCs w:val="24"/>
+              </w:rPr>
+              <w:fldChar w:fldCharType="begin"/>
+            </w:r>
+            <w:r>
+              <w:rPr>
+                <w:rFonts w:ascii="Times New Roman" w:hAnsi="Times New Roman" w:cs="Times New Roman"/>
+                <w:noProof/>
+                <w:webHidden/>
+                <w:sz w:val="24"/>
+                <w:szCs w:val="24"/>
+              </w:rPr>
+              <w:instrText xml:space="preserve"> PAGEREF _Toc242871878 \h </w:instrText>
+            </w:r>
+            <w:r>
+              <w:rPr>
+                <w:rFonts w:ascii="Times New Roman" w:hAnsi="Times New Roman" w:cs="Times New Roman"/>
+                <w:noProof/>
+                <w:webHidden/>
+                <w:sz w:val="24"/>
+                <w:szCs w:val="24"/>
+              </w:rPr>
+            </w:r>
+            <w:r>
+              <w:rPr>
+                <w:rFonts w:ascii="Times New Roman" w:hAnsi="Times New Roman" w:cs="Times New Roman"/>
+                <w:noProof/>
+                <w:webHidden/>
+                <w:sz w:val="24"/>
+                <w:szCs w:val="24"/>
+              </w:rPr>
+              <w:fldChar w:fldCharType="separate"/>
+            </w:r>
+            <w:r>
+              <w:rPr>
+                <w:rFonts w:ascii="Times New Roman" w:hAnsi="Times New Roman" w:cs="Times New Roman"/>
+                <w:noProof/>
+                <w:webHidden/>
+                <w:sz w:val="24"/>
+                <w:szCs w:val="24"/>
+              </w:rPr>
+              <w:t>6</w:t>
+            </w:r>
+            <w:r>
+              <w:rPr>
+                <w:rFonts w:ascii="Times New Roman" w:hAnsi="Times New Roman" w:cs="Times New Roman"/>
+                <w:noProof/>
+                <w:webHidden/>
+                <w:sz w:val="24"/>
+                <w:szCs w:val="24"/>
+              </w:rPr>
+              <w:fldChar w:fldCharType="end"/>
+            </w:r>
+          </w:hyperlink>
+        </w:p>
+        <w:p>
+          <w:pPr>
+            <w:pStyle w:val="TDC2"/>
+            <w:tabs>
+              <w:tab w:val="right" w:leader="dot" w:pos="8494"/>
+            </w:tabs>
+            <w:rPr>
+              <w:rFonts w:ascii="Times New Roman" w:hAnsi="Times New Roman" w:cs="Times New Roman"/>
+              <w:noProof/>
+              <w:sz w:val="24"/>
+              <w:szCs w:val="24"/>
+            </w:rPr>
+          </w:pPr>
+          <w:hyperlink w:anchor="_Toc242871879" w:history="1">
+            <w:r>
+              <w:rPr>
+                <w:rStyle w:val="Hipervnculo"/>
+                <w:rFonts w:ascii="Times New Roman" w:hAnsi="Times New Roman" w:cs="Times New Roman"/>
+                <w:noProof/>
+                <w:sz w:val="24"/>
+                <w:szCs w:val="24"/>
+              </w:rPr>
+              <w:t>5. Conclusiones</w:t>
+            </w:r>
+            <w:r>
+              <w:rPr>
+                <w:rFonts w:ascii="Times New Roman" w:hAnsi="Times New Roman" w:cs="Times New Roman"/>
+                <w:noProof/>
+                <w:webHidden/>
+                <w:sz w:val="24"/>
+                <w:szCs w:val="24"/>
+              </w:rPr>
+              <w:tab/>
+            </w:r>
+            <w:r>
+              <w:rPr>
+                <w:rFonts w:ascii="Times New Roman" w:hAnsi="Times New Roman" w:cs="Times New Roman"/>
+                <w:noProof/>
+                <w:webHidden/>
+                <w:sz w:val="24"/>
+                <w:szCs w:val="24"/>
+              </w:rPr>
+              <w:fldChar w:fldCharType="begin"/>
+            </w:r>
+            <w:r>
+              <w:rPr>
+                <w:rFonts w:ascii="Times New Roman" w:hAnsi="Times New Roman" w:cs="Times New Roman"/>
+                <w:noProof/>
+                <w:webHidden/>
+                <w:sz w:val="24"/>
+                <w:szCs w:val="24"/>
+              </w:rPr>
+              <w:instrText xml:space="preserve"> PAGEREF _Toc242871879 \h </w:instrText>
+            </w:r>
+            <w:r>
+              <w:rPr>
+                <w:rFonts w:ascii="Times New Roman" w:hAnsi="Times New Roman" w:cs="Times New Roman"/>
+                <w:noProof/>
+                <w:webHidden/>
+                <w:sz w:val="24"/>
+                <w:szCs w:val="24"/>
+              </w:rPr>
+            </w:r>
+            <w:r>
+              <w:rPr>
+                <w:rFonts w:ascii="Times New Roman" w:hAnsi="Times New Roman" w:cs="Times New Roman"/>
+                <w:noProof/>
+                <w:webHidden/>
+                <w:sz w:val="24"/>
+                <w:szCs w:val="24"/>
+              </w:rPr>
+              <w:fldChar w:fldCharType="separate"/>
+            </w:r>
+            <w:r>
+              <w:rPr>
+                <w:rFonts w:ascii="Times New Roman" w:hAnsi="Times New Roman" w:cs="Times New Roman"/>
+                <w:noProof/>
+                <w:webHidden/>
+                <w:sz w:val="24"/>
+                <w:szCs w:val="24"/>
+              </w:rPr>
+              <w:t>6</w:t>
+            </w:r>
+            <w:r>
+              <w:rPr>
+                <w:rFonts w:ascii="Times New Roman" w:hAnsi="Times New Roman" w:cs="Times New Roman"/>
+                <w:noProof/>
+                <w:webHidden/>
+                <w:sz w:val="24"/>
+                <w:szCs w:val="24"/>
+              </w:rPr>
+              <w:fldChar w:fldCharType="end"/>
+            </w:r>
+          </w:hyperlink>
+        </w:p>
+        <w:p>
+          <w:pPr>
+            <w:rPr>
+              <w:rFonts w:ascii="Times New Roman" w:hAnsi="Times New Roman" w:cs="Times New Roman"/>
+            </w:rPr>
+          </w:pPr>
+          <w:r>
+            <w:rPr>
+              <w:rFonts w:ascii="Times New Roman" w:hAnsi="Times New Roman" w:cs="Times New Roman"/>
+              <w:b/>
+              <w:bCs/>
+              <w:sz w:val="24"/>
+              <w:szCs w:val="24"/>
+              <w:lang w:val="es-ES"/>
+            </w:rPr>
+            <w:fldChar w:fldCharType="end"/>
+          </w:r>
+        </w:p>
+      </w:sdtContent>
+    </w:sdt>
+    <w:p>
+      <w:pPr>
+        <w:rPr>
+          <w:rFonts w:ascii="Times New Roman" w:hAnsi="Times New Roman" w:cs="Times New Roman"/>
+        </w:rPr>
+      </w:pPr>
+      <w:r>
+        <w:rPr>
+          <w:rFonts w:ascii="Times New Roman" w:hAnsi="Times New Roman" w:cs="Times New Roman"/>
+        </w:rPr>
+        <w:br w:type="page"/>
+      </w:r>
+    </w:p>
+    <w:p>
+      <w:pPr>
+        <w:pStyle w:val="Ttulo2"/>
+        <w:jc w:val="both"/>
+      </w:pPr>
+      <w:bookmarkStart w:id="0" w:name="_Toc242871867"/>
       <w:r>
         <w:lastRenderedPageBreak/>
-        <w:br w:type="page"/>
-      </w:r>
-    </w:p>
-    <w:p>
+        <w:t>1. Introducción y Descripción del Escenario</w:t>
+      </w:r>
+      <w:bookmarkEnd w:id="0"/>
+    </w:p>
+    <w:p>
+      <w:pPr>
+        <w:pStyle w:val="NormalWeb"/>
+        <w:jc w:val="both"/>
+      </w:pPr>
+      <w:r>
+        <w:t xml:space="preserve">El presente informe detalla el diseño de la arquitectura lógica para un </w:t>
+      </w:r>
+      <w:r>
+        <w:rPr>
+          <w:b/>
+          <w:bCs/>
+        </w:rPr>
+        <w:t>Sistema de Control de Rescate y Adopción Animal</w:t>
+      </w:r>
+      <w:r>
+        <w:t>. Este software busca automatizar y optimizar los procesos de registro de animales rescatados, el control de su historial médico, la gestión de adopciones y el seguimiento por parte de los administradores y rescatistas de una fundación o refugio.</w:t>
+      </w:r>
+    </w:p>
+    <w:p>
+      <w:pPr>
+        <w:pStyle w:val="NormalWeb"/>
+        <w:jc w:val="both"/>
+      </w:pPr>
+      <w:r>
+        <w:t>El propósito de este desarrollo bajo el paradigma orientado a objetos es garantizar una solución escalable, mantenible y robusta, aplicando buenas prácticas de ingeniería de software, estándares de modelado UML y un flujo de trabajo profesional mediante control de versiones.</w:t>
+      </w:r>
+    </w:p>
+    <w:p>
+      <w:pPr>
+        <w:pStyle w:val="Ttulo2"/>
+        <w:jc w:val="both"/>
+      </w:pPr>
+      <w:bookmarkStart w:id="1" w:name="_Toc242871868"/>
+      <w:r>
+        <w:t>2. Análisis de Requerimientos</w:t>
+      </w:r>
+      <w:bookmarkEnd w:id="1"/>
+    </w:p>
+    <w:p>
+      <w:pPr>
+        <w:pStyle w:val="Ttulo3"/>
+        <w:jc w:val="both"/>
+      </w:pPr>
+      <w:bookmarkStart w:id="2" w:name="_Toc242871869"/>
+      <w:r>
+        <w:t>2.1. Identificación de Actores</w:t>
+      </w:r>
+      <w:bookmarkEnd w:id="2"/>
+    </w:p>
+    <w:p>
+      <w:pPr>
+        <w:pStyle w:val="NormalWeb"/>
+        <w:numPr>
+          <w:ilvl w:val="0"/>
+          <w:numId w:val="1"/>
+        </w:numPr>
+        <w:jc w:val="both"/>
+      </w:pPr>
+      <w:r>
+        <w:rPr>
+          <w:b/>
+          <w:bCs/>
+        </w:rPr>
+        <w:t>Ciudadano / Adoptante:</w:t>
+      </w:r>
+      <w:r>
+        <w:t xml:space="preserve"> Usuario interesado en consultar el catálogo de animales disponibles e iniciar una solicitud de adopción.</w:t>
+      </w:r>
+    </w:p>
+    <w:p>
+      <w:pPr>
+        <w:pStyle w:val="NormalWeb"/>
+        <w:numPr>
+          <w:ilvl w:val="0"/>
+          <w:numId w:val="1"/>
+        </w:numPr>
+        <w:jc w:val="both"/>
+      </w:pPr>
+      <w:r>
+        <w:rPr>
+          <w:b/>
+          <w:bCs/>
+        </w:rPr>
+        <w:t>Rescatista:</w:t>
+      </w:r>
+      <w:r>
+        <w:t xml:space="preserve"> Personal encargado de registrar los ingresos de nuevos animales rescatados al sistema y actualizar su estado de salud inicial.</w:t>
+      </w:r>
+    </w:p>
+    <w:p>
+      <w:pPr>
+        <w:pStyle w:val="NormalWeb"/>
+        <w:numPr>
+          <w:ilvl w:val="0"/>
+          <w:numId w:val="1"/>
+        </w:numPr>
+        <w:jc w:val="both"/>
+      </w:pPr>
+      <w:r>
+        <w:rPr>
+          <w:b/>
+          <w:bCs/>
+        </w:rPr>
+        <w:t>Administrador:</w:t>
+      </w:r>
+      <w:r>
+        <w:t xml:space="preserve"> Usuario con privilegios totales para gestionar el catálogo general, aprobar o rechazar solicitudes de adopción y generar reportes operativos.</w:t>
+      </w:r>
+    </w:p>
+    <w:p>
+      <w:pPr>
+        <w:pStyle w:val="Ttulo3"/>
+        <w:jc w:val="both"/>
+      </w:pPr>
+      <w:bookmarkStart w:id="3" w:name="_Toc242871870"/>
+      <w:r>
+        <w:t>2.2. Requerimientos Funcionales</w:t>
+      </w:r>
+      <w:bookmarkEnd w:id="3"/>
+    </w:p>
+    <w:p>
+      <w:pPr>
+        <w:pStyle w:val="NormalWeb"/>
+        <w:numPr>
+          <w:ilvl w:val="0"/>
+          <w:numId w:val="2"/>
+        </w:numPr>
+        <w:jc w:val="both"/>
+      </w:pPr>
+      <w:r>
+        <w:rPr>
+          <w:b/>
+          <w:bCs/>
+        </w:rPr>
+        <w:t>RF01:</w:t>
+      </w:r>
+      <w:r>
+        <w:t xml:space="preserve"> El sistema debe permitir registrar el ingreso de un animal rescatado indicando sus características físicas, especie, raza y ubicación de rescate.</w:t>
+      </w:r>
+    </w:p>
+    <w:p>
+      <w:pPr>
+        <w:pStyle w:val="NormalWeb"/>
+        <w:numPr>
+          <w:ilvl w:val="0"/>
+          <w:numId w:val="2"/>
+        </w:numPr>
+        <w:jc w:val="both"/>
+      </w:pPr>
+      <w:r>
+        <w:rPr>
+          <w:b/>
+          <w:bCs/>
+        </w:rPr>
+        <w:t>RF02:</w:t>
+      </w:r>
+      <w:r>
+        <w:t xml:space="preserve"> El sistema debe permitir llevar un control del historial médico y tratamientos de cada animal.</w:t>
+      </w:r>
+    </w:p>
+    <w:p>
+      <w:pPr>
+        <w:pStyle w:val="NormalWeb"/>
+        <w:numPr>
+          <w:ilvl w:val="0"/>
+          <w:numId w:val="2"/>
+        </w:numPr>
+        <w:jc w:val="both"/>
+      </w:pPr>
+      <w:r>
+        <w:rPr>
+          <w:b/>
+          <w:bCs/>
+        </w:rPr>
+        <w:t>RF03:</w:t>
+      </w:r>
+      <w:r>
+        <w:t xml:space="preserve"> El ciudadano debe poder registrarse en la plataforma y enviar una solicitud de adopción adjuntando los requisitos solicitados.</w:t>
+      </w:r>
+    </w:p>
+    <w:p>
+      <w:pPr>
+        <w:pStyle w:val="NormalWeb"/>
+        <w:numPr>
+          <w:ilvl w:val="0"/>
+          <w:numId w:val="2"/>
+        </w:numPr>
+        <w:jc w:val="both"/>
+      </w:pPr>
+      <w:r>
+        <w:rPr>
+          <w:b/>
+          <w:bCs/>
+        </w:rPr>
+        <w:t>RF04:</w:t>
+      </w:r>
+      <w:r>
+        <w:t xml:space="preserve"> El administrador debe poder evaluar, aprobar o rechazar las solicitudes de adopción basándose en los criterios de la institución.</w:t>
+      </w:r>
+    </w:p>
+    <w:p>
+      <w:pPr>
+        <w:pStyle w:val="Ttulo3"/>
+        <w:jc w:val="both"/>
+      </w:pPr>
+      <w:bookmarkStart w:id="4" w:name="_Toc242871871"/>
+      <w:r>
+        <w:t>2.3. Requerimientos No Funcionales</w:t>
+      </w:r>
+      <w:bookmarkEnd w:id="4"/>
+    </w:p>
+    <w:p>
+      <w:pPr>
+        <w:pStyle w:val="NormalWeb"/>
+        <w:numPr>
+          <w:ilvl w:val="0"/>
+          <w:numId w:val="3"/>
+        </w:numPr>
+        <w:jc w:val="both"/>
+      </w:pPr>
+      <w:r>
+        <w:rPr>
+          <w:b/>
+          <w:bCs/>
+        </w:rPr>
+        <w:t>RNF01:</w:t>
+      </w:r>
+      <w:r>
+        <w:t xml:space="preserve"> La base de datos debe garantizar la integridad y confidencialidad de la información personal de los adoptantes.</w:t>
+      </w:r>
+    </w:p>
+    <w:p>
+      <w:pPr>
+        <w:pStyle w:val="NormalWeb"/>
+        <w:numPr>
+          <w:ilvl w:val="0"/>
+          <w:numId w:val="3"/>
+        </w:numPr>
+        <w:jc w:val="both"/>
+      </w:pPr>
+      <w:r>
+        <w:rPr>
+          <w:b/>
+          <w:bCs/>
+        </w:rPr>
+        <w:t>RNF02:</w:t>
+      </w:r>
+      <w:r>
+        <w:t xml:space="preserve"> El sistema debe ser altamente disponible y accesible mediante una interfaz web intuitiva o aplicación móvil.</w:t>
+      </w:r>
+    </w:p>
+    <w:p>
+      <w:pPr>
+        <w:pStyle w:val="NormalWeb"/>
+        <w:jc w:val="both"/>
+      </w:pPr>
+    </w:p>
+    <w:p>
+      <w:pPr>
+        <w:pStyle w:val="NormalWeb"/>
+        <w:jc w:val="both"/>
+      </w:pPr>
+    </w:p>
+    <w:p>
+      <w:pPr>
+        <w:pStyle w:val="NormalWeb"/>
+        <w:jc w:val="both"/>
+      </w:pPr>
+    </w:p>
+    <w:p>
+      <w:pPr>
+        <w:pStyle w:val="Ttulo2"/>
+        <w:jc w:val="both"/>
+      </w:pPr>
+      <w:bookmarkStart w:id="5" w:name="_Toc242871872"/>
       <w:r>
         <w:lastRenderedPageBreak/>
-        <w:br w:type="page"/>
-      </w:r>
-    </w:p>
-    <w:p/>
+        <w:t>3. Modelado UML</w:t>
+      </w:r>
+      <w:bookmarkEnd w:id="5"/>
+    </w:p>
+    <w:p>
+      <w:pPr>
+        <w:pStyle w:val="NormalWeb"/>
+        <w:jc w:val="both"/>
+      </w:pPr>
+      <w:r>
+        <w:t xml:space="preserve">A </w:t>
+      </w:r>
+      <w:r>
+        <w:t>continuación,</w:t>
+      </w:r>
+      <w:r>
+        <w:t xml:space="preserve"> se presentan los diagramas de modelado que estructuran el comportamiento y la estructura estática del sistema.</w:t>
+      </w:r>
+    </w:p>
+    <w:p>
+      <w:pPr>
+        <w:pStyle w:val="Ttulo3"/>
+        <w:jc w:val="both"/>
+      </w:pPr>
+      <w:bookmarkStart w:id="6" w:name="_Toc242871873"/>
+      <w:r>
+        <w:t>3.1. Diagrama de Casos de Uso</w:t>
+      </w:r>
+      <w:bookmarkEnd w:id="6"/>
+    </w:p>
+    <w:p>
+      <w:r>
+        <w:rPr>
+          <w:noProof/>
+        </w:rPr>
+        <w:drawing>
+          <wp:anchor distT="0" distB="0" distL="114300" distR="114300" simplePos="0" relativeHeight="251660288" behindDoc="0" locked="0" layoutInCell="1" allowOverlap="1" wp14:anchorId="0EEFA9D4" wp14:editId="001CD377">
+            <wp:simplePos x="0" y="0"/>
+            <wp:positionH relativeFrom="margin">
+              <wp:align>left</wp:align>
+            </wp:positionH>
+            <wp:positionV relativeFrom="paragraph">
+              <wp:posOffset>9407</wp:posOffset>
+            </wp:positionV>
+            <wp:extent cx="5401310" cy="7474585"/>
+            <wp:effectExtent l="0" t="0" r="8890" b="0"/>
+            <wp:wrapNone/>
+            <wp:docPr id="3" name="Imagen 3"/>
+            <wp:cNvGraphicFramePr>
+              <a:graphicFrameLocks xmlns:a="http://schemas.openxmlformats.org/drawingml/2006/main" noChangeAspect="1"/>
+            </wp:cNvGraphicFramePr>
+            <a:graphic xmlns:a="http://schemas.openxmlformats.org/drawingml/2006/main">
+              <a:graphicData uri="http://schemas.openxmlformats.org/drawingml/2006/picture">
+                <pic:pic xmlns:pic="http://schemas.openxmlformats.org/drawingml/2006/picture">
+                  <pic:nvPicPr>
+                    <pic:cNvPr id="0" name="Picture 1"/>
+                    <pic:cNvPicPr>
+                      <a:picLocks noChangeAspect="1" noChangeArrowheads="1"/>
+                    </pic:cNvPicPr>
+                  </pic:nvPicPr>
+                  <pic:blipFill>
+                    <a:blip r:embed="rId9">
+                      <a:extLst>
+                        <a:ext uri="{28A0092B-C50C-407E-A947-70E740481C1C}">
+                          <a14:useLocalDpi xmlns:a14="http://schemas.microsoft.com/office/drawing/2010/main" val="0"/>
+                        </a:ext>
+                      </a:extLst>
+                    </a:blip>
+                    <a:srcRect/>
+                    <a:stretch>
+                      <a:fillRect/>
+                    </a:stretch>
+                  </pic:blipFill>
+                  <pic:spPr bwMode="auto">
+                    <a:xfrm>
+                      <a:off x="0" y="0"/>
+                      <a:ext cx="5401310" cy="7474585"/>
+                    </a:xfrm>
+                    <a:prstGeom prst="rect">
+                      <a:avLst/>
+                    </a:prstGeom>
+                    <a:noFill/>
+                    <a:ln>
+                      <a:noFill/>
+                    </a:ln>
+                  </pic:spPr>
+                </pic:pic>
+              </a:graphicData>
+            </a:graphic>
+          </wp:anchor>
+        </w:drawing>
+      </w:r>
+    </w:p>
+    <w:p/>
+    <w:p/>
+    <w:p/>
+    <w:p/>
+    <w:p/>
+    <w:p/>
+    <w:p/>
+    <w:p/>
+    <w:p/>
+    <w:p/>
+    <w:p/>
+    <w:p/>
+    <w:p/>
+    <w:p/>
+    <w:p/>
+    <w:p/>
+    <w:p/>
+    <w:p/>
+    <w:p/>
+    <w:p/>
+    <w:p/>
+    <w:p/>
+    <w:p/>
+    <w:p/>
+    <w:p/>
+    <w:p>
+      <w:pPr>
+        <w:pStyle w:val="Ttulo3"/>
+        <w:jc w:val="both"/>
+      </w:pPr>
+      <w:bookmarkStart w:id="7" w:name="_Toc242871874"/>
+      <w:r>
+        <w:rPr>
+          <w:noProof/>
+        </w:rPr>
+        <w:lastRenderedPageBreak/>
+        <w:drawing>
+          <wp:anchor distT="0" distB="0" distL="114300" distR="114300" simplePos="0" relativeHeight="251661312" behindDoc="0" locked="0" layoutInCell="1" allowOverlap="1" wp14:anchorId="42E573F7" wp14:editId="3DA6C882">
+            <wp:simplePos x="0" y="0"/>
+            <wp:positionH relativeFrom="margin">
+              <wp:align>center</wp:align>
+            </wp:positionH>
+            <wp:positionV relativeFrom="paragraph">
+              <wp:posOffset>240030</wp:posOffset>
+            </wp:positionV>
+            <wp:extent cx="3011176" cy="8621486"/>
+            <wp:effectExtent l="0" t="0" r="0" b="8255"/>
+            <wp:wrapNone/>
+            <wp:docPr id="4" name="Imagen 4"/>
+            <wp:cNvGraphicFramePr>
+              <a:graphicFrameLocks xmlns:a="http://schemas.openxmlformats.org/drawingml/2006/main" noChangeAspect="1"/>
+            </wp:cNvGraphicFramePr>
+            <a:graphic xmlns:a="http://schemas.openxmlformats.org/drawingml/2006/main">
+              <a:graphicData uri="http://schemas.openxmlformats.org/drawingml/2006/picture">
+                <pic:pic xmlns:pic="http://schemas.openxmlformats.org/drawingml/2006/picture">
+                  <pic:nvPicPr>
+                    <pic:cNvPr id="0" name="Picture 2"/>
+                    <pic:cNvPicPr>
+                      <a:picLocks noChangeAspect="1" noChangeArrowheads="1"/>
+                    </pic:cNvPicPr>
+                  </pic:nvPicPr>
+                  <pic:blipFill>
+                    <a:blip r:embed="rId10" cstate="print">
+                      <a:extLst>
+                        <a:ext uri="{28A0092B-C50C-407E-A947-70E740481C1C}">
+                          <a14:useLocalDpi xmlns:a14="http://schemas.microsoft.com/office/drawing/2010/main" val="0"/>
+                        </a:ext>
+                      </a:extLst>
+                    </a:blip>
+                    <a:srcRect/>
+                    <a:stretch>
+                      <a:fillRect/>
+                    </a:stretch>
+                  </pic:blipFill>
+                  <pic:spPr bwMode="auto">
+                    <a:xfrm>
+                      <a:off x="0" y="0"/>
+                      <a:ext cx="3011176" cy="8621486"/>
+                    </a:xfrm>
+                    <a:prstGeom prst="rect">
+                      <a:avLst/>
+                    </a:prstGeom>
+                    <a:noFill/>
+                    <a:ln>
+                      <a:noFill/>
+                    </a:ln>
+                  </pic:spPr>
+                </pic:pic>
+              </a:graphicData>
+            </a:graphic>
+            <wp14:sizeRelH relativeFrom="margin">
+              <wp14:pctWidth>0</wp14:pctWidth>
+            </wp14:sizeRelH>
+            <wp14:sizeRelV relativeFrom="margin">
+              <wp14:pctHeight>0</wp14:pctHeight>
+            </wp14:sizeRelV>
+          </wp:anchor>
+        </w:drawing>
+      </w:r>
+      <w:r>
+        <w:t>3.2. Diagrama de Clases</w:t>
+      </w:r>
+      <w:bookmarkEnd w:id="7"/>
+    </w:p>
+    <w:p/>
+    <w:p/>
+    <w:p/>
+    <w:p/>
+    <w:p/>
+    <w:p/>
+    <w:p/>
+    <w:p/>
+    <w:p/>
+    <w:p/>
+    <w:p/>
+    <w:p/>
+    <w:p/>
+    <w:p/>
+    <w:p/>
+    <w:p/>
+    <w:p/>
+    <w:p/>
+    <w:p/>
+    <w:p/>
+    <w:p/>
+    <w:p/>
+    <w:p/>
+    <w:p/>
+    <w:p/>
+    <w:p/>
+    <w:p/>
+    <w:p/>
+    <w:p/>
+    <w:p>
+      <w:pPr>
+        <w:pStyle w:val="Ttulo2"/>
+        <w:jc w:val="both"/>
+      </w:pPr>
+      <w:bookmarkStart w:id="8" w:name="_Toc242871875"/>
+      <w:r>
+        <w:lastRenderedPageBreak/>
+        <w:t>4. Implementación de Patrones de Diseño</w:t>
+      </w:r>
+      <w:bookmarkEnd w:id="8"/>
+    </w:p>
+    <w:p>
+      <w:pPr>
+        <w:pStyle w:val="NormalWeb"/>
+        <w:jc w:val="both"/>
+      </w:pPr>
+      <w:r>
+        <w:t>Para resolver problemas recurrentes de arquitectura y asegurar un código limpio, se han integrado tres patrones de diseño fundamentales:</w:t>
+      </w:r>
+    </w:p>
+    <w:p>
+      <w:pPr>
+        <w:pStyle w:val="Ttulo3"/>
+        <w:jc w:val="both"/>
+      </w:pPr>
+      <w:bookmarkStart w:id="9" w:name="_Toc242871876"/>
+      <w:r>
+        <w:t xml:space="preserve">4.1. Patrón Creacional: </w:t>
+      </w:r>
+      <w:r>
+        <w:rPr>
+          <w:i/>
+          <w:iCs/>
+        </w:rPr>
+        <w:t xml:space="preserve">Factory </w:t>
+      </w:r>
+      <w:proofErr w:type="spellStart"/>
+      <w:r>
+        <w:rPr>
+          <w:i/>
+          <w:iCs/>
+        </w:rPr>
+        <w:t>Method</w:t>
+      </w:r>
+      <w:bookmarkEnd w:id="9"/>
+      <w:proofErr w:type="spellEnd"/>
+    </w:p>
+    <w:p>
+      <w:pPr>
+        <w:pStyle w:val="NormalWeb"/>
+        <w:numPr>
+          <w:ilvl w:val="0"/>
+          <w:numId w:val="4"/>
+        </w:numPr>
+        <w:jc w:val="both"/>
+      </w:pPr>
+      <w:r>
+        <w:rPr>
+          <w:b/>
+          <w:bCs/>
+        </w:rPr>
+        <w:t>Aplicación:</w:t>
+      </w:r>
+      <w:r>
+        <w:t xml:space="preserve"> Se utiliza para la creación dinámica de objetos de tipo </w:t>
+      </w:r>
+      <w:r>
+        <w:rPr>
+          <w:rStyle w:val="CdigoHTML"/>
+        </w:rPr>
+        <w:t>Animal</w:t>
+      </w:r>
+      <w:r>
+        <w:t xml:space="preserve"> (por ejemplo, </w:t>
+      </w:r>
+      <w:r>
+        <w:rPr>
+          <w:rStyle w:val="CdigoHTML"/>
+        </w:rPr>
+        <w:t>Perro</w:t>
+      </w:r>
+      <w:r>
+        <w:t xml:space="preserve">, </w:t>
+      </w:r>
+      <w:r>
+        <w:rPr>
+          <w:rStyle w:val="CdigoHTML"/>
+        </w:rPr>
+        <w:t>Gato</w:t>
+      </w:r>
+      <w:r>
+        <w:t xml:space="preserve">, </w:t>
+      </w:r>
+      <w:r>
+        <w:rPr>
+          <w:rStyle w:val="CdigoHTML"/>
+        </w:rPr>
+        <w:t>Ave</w:t>
+      </w:r>
+      <w:r>
+        <w:t>) dependiendo de la especie ingresada por el rescatista en el momento del rescate. Esto desacopla la lógica de creación de clases concretas y facilita la incorporación de nuevas especies en el futuro sin modificar el código principal.</w:t>
+      </w:r>
+    </w:p>
+    <w:p>
+      <w:pPr>
+        <w:pStyle w:val="Ttulo3"/>
+        <w:jc w:val="both"/>
+      </w:pPr>
+      <w:bookmarkStart w:id="10" w:name="_Toc242871877"/>
+      <w:r>
+        <w:t xml:space="preserve">4.2. Patrón Estructural: </w:t>
+      </w:r>
+      <w:proofErr w:type="spellStart"/>
+      <w:r>
+        <w:rPr>
+          <w:i/>
+          <w:iCs/>
+        </w:rPr>
+        <w:t>Singleton</w:t>
+      </w:r>
+      <w:bookmarkEnd w:id="10"/>
+      <w:proofErr w:type="spellEnd"/>
+    </w:p>
+    <w:p>
+      <w:pPr>
+        <w:pStyle w:val="NormalWeb"/>
+        <w:numPr>
+          <w:ilvl w:val="0"/>
+          <w:numId w:val="5"/>
+        </w:numPr>
+        <w:jc w:val="both"/>
+      </w:pPr>
+      <w:r>
+        <w:rPr>
+          <w:b/>
+          <w:bCs/>
+        </w:rPr>
+        <w:t>Aplicación:</w:t>
+      </w:r>
+      <w:r>
+        <w:t xml:space="preserve"> Se implementa en la clase de gestión de conexión a la base de datos (</w:t>
+      </w:r>
+      <w:proofErr w:type="spellStart"/>
+      <w:r>
+        <w:rPr>
+          <w:rStyle w:val="CdigoHTML"/>
+        </w:rPr>
+        <w:t>DatabaseConnection</w:t>
+      </w:r>
+      <w:proofErr w:type="spellEnd"/>
+      <w:r>
+        <w:t>). Garantiza que exista una única instancia de conexión activa durante toda la ejecución del sistema, optimizando recursos y evitando aperturas innecesarias de canales de comunicación con el servidor de datos.</w:t>
+      </w:r>
+    </w:p>
+    <w:p>
+      <w:pPr>
+        <w:pStyle w:val="Ttulo3"/>
+        <w:jc w:val="both"/>
+      </w:pPr>
+      <w:bookmarkStart w:id="11" w:name="_Toc242871878"/>
+      <w:r>
+        <w:t xml:space="preserve">4.3. Patrón de Comportamiento: </w:t>
+      </w:r>
+      <w:proofErr w:type="spellStart"/>
+      <w:r>
+        <w:rPr>
+          <w:i/>
+          <w:iCs/>
+        </w:rPr>
+        <w:t>Observer</w:t>
+      </w:r>
+      <w:bookmarkEnd w:id="11"/>
+      <w:proofErr w:type="spellEnd"/>
+    </w:p>
+    <w:p>
+      <w:pPr>
+        <w:pStyle w:val="NormalWeb"/>
+        <w:numPr>
+          <w:ilvl w:val="0"/>
+          <w:numId w:val="6"/>
+        </w:numPr>
+        <w:jc w:val="both"/>
+      </w:pPr>
+      <w:r>
+        <w:rPr>
+          <w:b/>
+          <w:bCs/>
+        </w:rPr>
+        <w:t>Aplicación:</w:t>
+      </w:r>
+      <w:r>
+        <w:t xml:space="preserve"> Se aplica en el proceso de solicitud de adopción. La clase </w:t>
+      </w:r>
+      <w:proofErr w:type="spellStart"/>
+      <w:r>
+        <w:rPr>
+          <w:rStyle w:val="CdigoHTML"/>
+        </w:rPr>
+        <w:t>SolicitudAdopcion</w:t>
+      </w:r>
+      <w:proofErr w:type="spellEnd"/>
+      <w:r>
+        <w:t xml:space="preserve"> actúa como el sujeto (</w:t>
+      </w:r>
+      <w:proofErr w:type="spellStart"/>
+      <w:r>
+        <w:rPr>
+          <w:i/>
+          <w:iCs/>
+        </w:rPr>
+        <w:t>Subject</w:t>
+      </w:r>
+      <w:proofErr w:type="spellEnd"/>
+      <w:r>
+        <w:t>) y los usuarios adoptantes o el sistema de notificaciones actúan como observadores (</w:t>
+      </w:r>
+      <w:proofErr w:type="spellStart"/>
+      <w:r>
+        <w:rPr>
+          <w:i/>
+          <w:iCs/>
+        </w:rPr>
+        <w:t>Observers</w:t>
+      </w:r>
+      <w:proofErr w:type="spellEnd"/>
+      <w:r>
+        <w:t>). Cuando el administrador cambia el estado de una solicitud (de "En revisión" a "Aprobada" o "Rechazada"), el sistema notifica automáticamente al adoptante vía correo o interfaz sin acoplar fuertemente ambas clases.</w:t>
+      </w:r>
+    </w:p>
+    <w:p>
+      <w:pPr>
+        <w:pStyle w:val="Ttulo2"/>
+        <w:jc w:val="both"/>
+      </w:pPr>
+      <w:bookmarkStart w:id="12" w:name="_Toc242871879"/>
+      <w:r>
+        <w:t>5</w:t>
+      </w:r>
+      <w:r>
+        <w:t>. Conclusiones</w:t>
+      </w:r>
+      <w:bookmarkEnd w:id="12"/>
+    </w:p>
+    <w:p>
+      <w:pPr>
+        <w:pStyle w:val="NormalWeb"/>
+        <w:jc w:val="both"/>
+      </w:pPr>
+      <w:r>
+        <w:t xml:space="preserve">El desarrollo de esta primera actividad permitió consolidar los conceptos teóricos y prácticos de la ingeniería de software moderna. El análisis previo y el modelado mediante UML facilitan una visión clara del alcance del sistema, mientras que la selección consciente de patrones de diseño asegura que la arquitectura sea escalable frente a futuros requerimientos. Asimismo, el dominio de Git y </w:t>
+      </w:r>
+      <w:proofErr w:type="spellStart"/>
+      <w:r>
+        <w:t>Gitflow</w:t>
+      </w:r>
+      <w:proofErr w:type="spellEnd"/>
+      <w:r>
+        <w:t xml:space="preserve"> fortalece las habilidades profesionales para trabajar de manera colaborativa y ordenada en proyectos tecnológicos.</w:t>
+      </w:r>
+    </w:p>
+    <w:p>
+      <w:pPr>
+        <w:jc w:val="both"/>
+      </w:pPr>
+    </w:p>
     <w:sectPr>
-      <w:headerReference w:type="first" r:id="rId6"/>
+      <w:footerReference w:type="default" r:id="rId11"/>
+      <w:headerReference w:type="first" r:id="rId12"/>
       <w:pgSz w:w="11906" w:h="16838"/>
       <w:pgMar w:top="1417" w:right="1701" w:bottom="1417" w:left="1701" w:header="708" w:footer="708" w:gutter="0"/>
       <w:cols w:space="708"/>
@@ -491,6 +2689,132 @@
     </w:p>
   </w:endnote>
 </w:endnotes>
+</file>
+
+<file path=word/footer1.xml><?xml version="1.0" encoding="utf-8"?>
+<w:ftr xmlns:wpc="http://schemas.microsoft.com/office/word/2010/wordprocessingCanvas" xmlns:cx="http://schemas.microsoft.com/office/drawing/2014/chartex" xmlns:cx1="http://schemas.microsoft.com/office/drawing/2015/9/8/chartex" xmlns:cx2="http://schemas.microsoft.com/office/drawing/2015/10/21/chartex" xmlns:cx3="http://schemas.microsoft.com/office/drawing/2016/5/9/chartex" xmlns:cx4="http://schemas.microsoft.com/office/drawing/2016/5/10/chartex" xmlns:cx5="http://schemas.microsoft.com/office/drawing/2016/5/11/chartex" xmlns:cx6="http://schemas.microsoft.com/office/drawing/2016/5/12/chartex" xmlns:cx7="http://schemas.microsoft.com/office/drawing/2016/5/13/chartex" xmlns:cx8="http://schemas.microsoft.com/office/drawing/2016/5/14/chartex" xmlns:mc="http://schemas.openxmlformats.org/markup-compatibility/2006" xmlns:aink="http://schemas.microsoft.com/office/drawing/2016/ink" xmlns:am3d="http://schemas.microsoft.com/office/drawing/2017/model3d" xmlns:o="urn:schemas-microsoft-com:office:office" xmlns:r="http://schemas.openxmlformats.org/officeDocument/2006/relationships" xmlns:m="http://schemas.openxmlformats.org/officeDocument/2006/math" xmlns:v="urn:schemas-microsoft-com:vml" xmlns:wp14="http://schemas.microsoft.com/office/word/2010/wordprocessingDrawing" xmlns:wp="http://schemas.openxmlformats.org/drawingml/2006/wordprocessingDrawing" xmlns:w10="urn:schemas-microsoft-com:office:word" xmlns:w="http://schemas.openxmlformats.org/wordprocessingml/2006/main" xmlns:w14="http://schemas.microsoft.com/office/word/2010/wordml" xmlns:w15="http://schemas.microsoft.com/office/word/2012/wordml" xmlns:w16cex="http://schemas.microsoft.com/office/word/2018/wordml/cex" xmlns:w16cid="http://schemas.microsoft.com/office/word/2016/wordml/cid" xmlns:w16="http://schemas.microsoft.com/office/word/2018/wordml" xmlns:w16sdtdh="http://schemas.microsoft.com/office/word/2020/wordml/sdtdatahash" xmlns:w16se="http://schemas.microsoft.com/office/word/2015/wordml/symex" xmlns:wpg="http://schemas.microsoft.com/office/word/2010/wordprocessingGroup" xmlns:wpi="http://schemas.microsoft.com/office/word/2010/wordprocessingInk" xmlns:wne="http://schemas.microsoft.com/office/word/2006/wordml" xmlns:wps="http://schemas.microsoft.com/office/word/2010/wordprocessingShape" mc:Ignorable="w14 w15 w16se w16cid w16 w16cex w16sdtdh wp14">
+  <w:sdt>
+    <w:sdtPr>
+      <w:id w:val="-633490477"/>
+      <w:docPartObj>
+        <w:docPartGallery w:val="Page Numbers (Bottom of Page)"/>
+        <w:docPartUnique/>
+      </w:docPartObj>
+    </w:sdtPr>
+    <w:sdtContent>
+      <w:p>
+        <w:pPr>
+          <w:pStyle w:val="Piedepgina"/>
+          <w:jc w:val="center"/>
+        </w:pPr>
+        <w:r>
+          <w:rPr>
+            <w:noProof/>
+          </w:rPr>
+          <mc:AlternateContent>
+            <mc:Choice Requires="wps">
+              <w:drawing>
+                <wp:inline distT="0" distB="0" distL="0" distR="0" wp14:anchorId="55465FEC" wp14:editId="715684A4">
+                  <wp:extent cx="5467350" cy="45085"/>
+                  <wp:effectExtent l="9525" t="9525" r="0" b="2540"/>
+                  <wp:docPr id="5" name="Diagrama de flujo: decisión 5" descr="Light horizontal"/>
+                  <wp:cNvGraphicFramePr>
+                    <a:graphicFrameLocks xmlns:a="http://schemas.openxmlformats.org/drawingml/2006/main"/>
+                  </wp:cNvGraphicFramePr>
+                  <a:graphic xmlns:a="http://schemas.openxmlformats.org/drawingml/2006/main">
+                    <a:graphicData uri="http://schemas.microsoft.com/office/word/2010/wordprocessingShape">
+                      <wps:wsp>
+                        <wps:cNvSpPr>
+                          <a:spLocks noChangeArrowheads="1"/>
+                        </wps:cNvSpPr>
+                        <wps:spPr bwMode="auto">
+                          <a:xfrm flipV="1">
+                            <a:off x="0" y="0"/>
+                            <a:ext cx="5467350" cy="45085"/>
+                          </a:xfrm>
+                          <a:prstGeom prst="flowChartDecision">
+                            <a:avLst/>
+                          </a:prstGeom>
+                          <a:pattFill prst="ltHorz">
+                            <a:fgClr>
+                              <a:srgbClr val="000000"/>
+                            </a:fgClr>
+                            <a:bgClr>
+                              <a:srgbClr val="FFFFFF"/>
+                            </a:bgClr>
+                          </a:pattFill>
+                          <a:ln>
+                            <a:noFill/>
+                          </a:ln>
+                          <a:extLst>
+                            <a:ext uri="{91240B29-F687-4F45-9708-019B960494DF}">
+                              <a14:hiddenLine xmlns:a14="http://schemas.microsoft.com/office/drawing/2010/main" w="9525">
+                                <a:solidFill>
+                                  <a:srgbClr val="000000"/>
+                                </a:solidFill>
+                                <a:miter lim="800000"/>
+                                <a:headEnd/>
+                                <a:tailEnd/>
+                              </a14:hiddenLine>
+                            </a:ext>
+                          </a:extLst>
+                        </wps:spPr>
+                        <wps:bodyPr rot="0" vert="horz" wrap="square" lIns="91440" tIns="45720" rIns="91440" bIns="45720" anchor="t" anchorCtr="0" upright="1">
+                          <a:noAutofit/>
+                        </wps:bodyPr>
+                      </wps:wsp>
+                    </a:graphicData>
+                  </a:graphic>
+                </wp:inline>
+              </w:drawing>
+            </mc:Choice>
+            <mc:Fallback>
+              <w:pict>
+                <v:shapetype w14:anchorId="2952E2FF" id="_x0000_t110" coordsize="21600,21600" o:spt="110" path="m10800,l,10800,10800,21600,21600,10800xe">
+                  <v:stroke joinstyle="miter"/>
+                  <v:path gradientshapeok="t" o:connecttype="rect" textboxrect="5400,5400,16200,16200"/>
+                </v:shapetype>
+                <v:shape id="Diagrama de flujo: decisión 5" o:spid="_x0000_s1026" type="#_x0000_t110" alt="Light horizontal" style="width:430.5pt;height:3.55pt;flip:y;visibility:visible;mso-wrap-style:square;mso-left-percent:-10001;mso-top-percent:-10001;mso-position-horizontal:absolute;mso-position-horizontal-relative:char;mso-position-vertical:absolute;mso-position-vertical-relative:line;mso-left-percent:-10001;mso-top-percent:-10001;v-text-anchor:top" o:gfxdata="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" fillcolor="black" stroked="f">
+                  <v:fill r:id="rId1" o:title="" type="pattern"/>
+                  <w10:anchorlock/>
+                </v:shape>
+              </w:pict>
+            </mc:Fallback>
+          </mc:AlternateContent>
+        </w:r>
+      </w:p>
+      <w:p>
+        <w:pPr>
+          <w:pStyle w:val="Piedepgina"/>
+          <w:jc w:val="center"/>
+        </w:pPr>
+        <w:r>
+          <w:fldChar w:fldCharType="begin"/>
+        </w:r>
+        <w:r>
+          <w:instrText>PAGE    \* MERGEFORMAT</w:instrText>
+        </w:r>
+        <w:r>
+          <w:fldChar w:fldCharType="separate"/>
+        </w:r>
+        <w:r>
+          <w:rPr>
+            <w:lang w:val="es-ES"/>
+          </w:rPr>
+          <w:t>2</w:t>
+        </w:r>
+        <w:r>
+          <w:fldChar w:fldCharType="end"/>
+        </w:r>
+      </w:p>
+    </w:sdtContent>
+  </w:sdt>
+  <w:p>
+    <w:pPr>
+      <w:pStyle w:val="Piedepgina"/>
+    </w:pPr>
+  </w:p>
+</w:ftr>
 </file>
 
 <file path=word/footnotes.xml><?xml version="1.0" encoding="utf-8"?>
@@ -584,6 +2908,1075 @@
     </w:r>
   </w:p>
 </w:hdr>
+</file>
+
+<file path=word/numbering.xml><?xml version="1.0" encoding="utf-8"?>
+<w:numbering xmlns:wpc="http://schemas.microsoft.com/office/word/2010/wordprocessingCanvas" xmlns:cx="http://schemas.microsoft.com/office/drawing/2014/chartex" xmlns:cx1="http://schemas.microsoft.com/office/drawing/2015/9/8/chartex" xmlns:cx2="http://schemas.microsoft.com/office/drawing/2015/10/21/chartex" xmlns:cx3="http://schemas.microsoft.com/office/drawing/2016/5/9/chartex" xmlns:cx4="http://schemas.microsoft.com/office/drawing/2016/5/10/chartex" xmlns:cx5="http://schemas.microsoft.com/office/drawing/2016/5/11/chartex" xmlns:cx6="http://schemas.microsoft.com/office/drawing/2016/5/12/chartex" xmlns:cx7="http://schemas.microsoft.com/office/drawing/2016/5/13/chartex" xmlns:cx8="http://schemas.microsoft.com/office/drawing/2016/5/14/chartex" xmlns:mc="http://schemas.openxmlformats.org/markup-compatibility/2006" xmlns:aink="http://schemas.microsoft.com/office/drawing/2016/ink" xmlns:am3d="http://schemas.microsoft.com/office/drawing/2017/model3d" xmlns:o="urn:schemas-microsoft-com:office:office" xmlns:r="http://schemas.openxmlformats.org/officeDocument/2006/relationships" xmlns:m="http://schemas.openxmlformats.org/officeDocument/2006/math" xmlns:v="urn:schemas-microsoft-com:vml" xmlns:wp14="http://schemas.microsoft.com/office/word/2010/wordprocessingDrawing" xmlns:wp="http://schemas.openxmlformats.org/drawingml/2006/wordprocessingDrawing" xmlns:w10="urn:schemas-microsoft-com:office:word" xmlns:w="http://schemas.openxmlformats.org/wordprocessingml/2006/main" xmlns:w14="http://schemas.microsoft.com/office/word/2010/wordml" xmlns:w15="http://schemas.microsoft.com/office/word/2012/wordml" xmlns:w16cex="http://schemas.microsoft.com/office/word/2018/wordml/cex" xmlns:w16cid="http://schemas.microsoft.com/office/word/2016/wordml/cid" xmlns:w16="http://schemas.microsoft.com/office/word/2018/wordml" xmlns:w16sdtdh="http://schemas.microsoft.com/office/word/2020/wordml/sdtdatahash" xmlns:w16se="http://schemas.microsoft.com/office/word/2015/wordml/symex" xmlns:wpg="http://schemas.microsoft.com/office/word/2010/wordprocessingGroup" xmlns:wpi="http://schemas.microsoft.com/office/word/2010/wordprocessingInk" xmlns:wne="http://schemas.microsoft.com/office/word/2006/wordml" xmlns:wps="http://schemas.microsoft.com/office/word/2010/wordprocessingShape" mc:Ignorable="w14 w15 w16se w16cid w16 w16cex w16sdtdh wp14">
+  <w:abstractNum w:abstractNumId="0" w15:restartNumberingAfterBreak="0">
+    <w:nsid w:val="08C947F7"/>
+    <w:multiLevelType w:val="multilevel"/>
+    <w:tmpl w:val="37D2E126"/>
+    <w:lvl w:ilvl="0">
+      <w:start w:val="1"/>
+      <w:numFmt w:val="bullet"/>
+      <w:lvlText w:val=""/>
+      <w:lvlJc w:val="left"/>
+      <w:pPr>
+        <w:tabs>
+          <w:tab w:val="num" w:pos="720"/>
+        </w:tabs>
+        <w:ind w:left="720" w:hanging="360"/>
+      </w:pPr>
+      <w:rPr>
+        <w:rFonts w:ascii="Symbol" w:hAnsi="Symbol" w:hint="default"/>
+        <w:sz w:val="20"/>
+      </w:rPr>
+    </w:lvl>
+    <w:lvl w:ilvl="1" w:tentative="1">
+      <w:start w:val="1"/>
+      <w:numFmt w:val="bullet"/>
+      <w:lvlText w:val="o"/>
+      <w:lvlJc w:val="left"/>
+      <w:pPr>
+        <w:tabs>
+          <w:tab w:val="num" w:pos="1440"/>
+        </w:tabs>
+        <w:ind w:left="1440" w:hanging="360"/>
+      </w:pPr>
+      <w:rPr>
+        <w:rFonts w:ascii="Courier New" w:hAnsi="Courier New" w:hint="default"/>
+        <w:sz w:val="20"/>
+      </w:rPr>
+    </w:lvl>
+    <w:lvl w:ilvl="2" w:tentative="1">
+      <w:start w:val="1"/>
+      <w:numFmt w:val="bullet"/>
+      <w:lvlText w:val=""/>
+      <w:lvlJc w:val="left"/>
+      <w:pPr>
+        <w:tabs>
+          <w:tab w:val="num" w:pos="2160"/>
+        </w:tabs>
+        <w:ind w:left="2160" w:hanging="360"/>
+      </w:pPr>
+      <w:rPr>
+        <w:rFonts w:ascii="Wingdings" w:hAnsi="Wingdings" w:hint="default"/>
+        <w:sz w:val="20"/>
+      </w:rPr>
+    </w:lvl>
+    <w:lvl w:ilvl="3" w:tentative="1">
+      <w:start w:val="1"/>
+      <w:numFmt w:val="bullet"/>
+      <w:lvlText w:val=""/>
+      <w:lvlJc w:val="left"/>
+      <w:pPr>
+        <w:tabs>
+          <w:tab w:val="num" w:pos="2880"/>
+        </w:tabs>
+        <w:ind w:left="2880" w:hanging="360"/>
+      </w:pPr>
+      <w:rPr>
+        <w:rFonts w:ascii="Wingdings" w:hAnsi="Wingdings" w:hint="default"/>
+        <w:sz w:val="20"/>
+      </w:rPr>
+    </w:lvl>
+    <w:lvl w:ilvl="4" w:tentative="1">
+      <w:start w:val="1"/>
+      <w:numFmt w:val="bullet"/>
+      <w:lvlText w:val=""/>
+      <w:lvlJc w:val="left"/>
+      <w:pPr>
+        <w:tabs>
+          <w:tab w:val="num" w:pos="3600"/>
+        </w:tabs>
+        <w:ind w:left="3600" w:hanging="360"/>
+      </w:pPr>
+      <w:rPr>
+        <w:rFonts w:ascii="Wingdings" w:hAnsi="Wingdings" w:hint="default"/>
+        <w:sz w:val="20"/>
+      </w:rPr>
+    </w:lvl>
+    <w:lvl w:ilvl="5" w:tentative="1">
+      <w:start w:val="1"/>
+      <w:numFmt w:val="bullet"/>
+      <w:lvlText w:val=""/>
+      <w:lvlJc w:val="left"/>
+      <w:pPr>
+        <w:tabs>
+          <w:tab w:val="num" w:pos="4320"/>
+        </w:tabs>
+        <w:ind w:left="4320" w:hanging="360"/>
+      </w:pPr>
+      <w:rPr>
+        <w:rFonts w:ascii="Wingdings" w:hAnsi="Wingdings" w:hint="default"/>
+        <w:sz w:val="20"/>
+      </w:rPr>
+    </w:lvl>
+    <w:lvl w:ilvl="6" w:tentative="1">
+      <w:start w:val="1"/>
+      <w:numFmt w:val="bullet"/>
+      <w:lvlText w:val=""/>
+      <w:lvlJc w:val="left"/>
+      <w:pPr>
+        <w:tabs>
+          <w:tab w:val="num" w:pos="5040"/>
+        </w:tabs>
+        <w:ind w:left="5040" w:hanging="360"/>
+      </w:pPr>
+      <w:rPr>
+        <w:rFonts w:ascii="Wingdings" w:hAnsi="Wingdings" w:hint="default"/>
+        <w:sz w:val="20"/>
+      </w:rPr>
+    </w:lvl>
+    <w:lvl w:ilvl="7" w:tentative="1">
+      <w:start w:val="1"/>
+      <w:numFmt w:val="bullet"/>
+      <w:lvlText w:val=""/>
+      <w:lvlJc w:val="left"/>
+      <w:pPr>
+        <w:tabs>
+          <w:tab w:val="num" w:pos="5760"/>
+        </w:tabs>
+        <w:ind w:left="5760" w:hanging="360"/>
+      </w:pPr>
+      <w:rPr>
+        <w:rFonts w:ascii="Wingdings" w:hAnsi="Wingdings" w:hint="default"/>
+        <w:sz w:val="20"/>
+      </w:rPr>
+    </w:lvl>
+    <w:lvl w:ilvl="8" w:tentative="1">
+      <w:start w:val="1"/>
+      <w:numFmt w:val="bullet"/>
+      <w:lvlText w:val=""/>
+      <w:lvlJc w:val="left"/>
+      <w:pPr>
+        <w:tabs>
+          <w:tab w:val="num" w:pos="6480"/>
+        </w:tabs>
+        <w:ind w:left="6480" w:hanging="360"/>
+      </w:pPr>
+      <w:rPr>
+        <w:rFonts w:ascii="Wingdings" w:hAnsi="Wingdings" w:hint="default"/>
+        <w:sz w:val="20"/>
+      </w:rPr>
+    </w:lvl>
+  </w:abstractNum>
+  <w:abstractNum w:abstractNumId="1" w15:restartNumberingAfterBreak="0">
+    <w:nsid w:val="0D5B0B99"/>
+    <w:multiLevelType w:val="multilevel"/>
+    <w:tmpl w:val="5E88E2A8"/>
+    <w:lvl w:ilvl="0">
+      <w:start w:val="1"/>
+      <w:numFmt w:val="bullet"/>
+      <w:lvlText w:val=""/>
+      <w:lvlJc w:val="left"/>
+      <w:pPr>
+        <w:tabs>
+          <w:tab w:val="num" w:pos="720"/>
+        </w:tabs>
+        <w:ind w:left="720" w:hanging="360"/>
+      </w:pPr>
+      <w:rPr>
+        <w:rFonts w:ascii="Symbol" w:hAnsi="Symbol" w:hint="default"/>
+        <w:sz w:val="20"/>
+      </w:rPr>
+    </w:lvl>
+    <w:lvl w:ilvl="1" w:tentative="1">
+      <w:start w:val="1"/>
+      <w:numFmt w:val="bullet"/>
+      <w:lvlText w:val="o"/>
+      <w:lvlJc w:val="left"/>
+      <w:pPr>
+        <w:tabs>
+          <w:tab w:val="num" w:pos="1440"/>
+        </w:tabs>
+        <w:ind w:left="1440" w:hanging="360"/>
+      </w:pPr>
+      <w:rPr>
+        <w:rFonts w:ascii="Courier New" w:hAnsi="Courier New" w:hint="default"/>
+        <w:sz w:val="20"/>
+      </w:rPr>
+    </w:lvl>
+    <w:lvl w:ilvl="2" w:tentative="1">
+      <w:start w:val="1"/>
+      <w:numFmt w:val="bullet"/>
+      <w:lvlText w:val=""/>
+      <w:lvlJc w:val="left"/>
+      <w:pPr>
+        <w:tabs>
+          <w:tab w:val="num" w:pos="2160"/>
+        </w:tabs>
+        <w:ind w:left="2160" w:hanging="360"/>
+      </w:pPr>
+      <w:rPr>
+        <w:rFonts w:ascii="Wingdings" w:hAnsi="Wingdings" w:hint="default"/>
+        <w:sz w:val="20"/>
+      </w:rPr>
+    </w:lvl>
+    <w:lvl w:ilvl="3" w:tentative="1">
+      <w:start w:val="1"/>
+      <w:numFmt w:val="bullet"/>
+      <w:lvlText w:val=""/>
+      <w:lvlJc w:val="left"/>
+      <w:pPr>
+        <w:tabs>
+          <w:tab w:val="num" w:pos="2880"/>
+        </w:tabs>
+        <w:ind w:left="2880" w:hanging="360"/>
+      </w:pPr>
+      <w:rPr>
+        <w:rFonts w:ascii="Wingdings" w:hAnsi="Wingdings" w:hint="default"/>
+        <w:sz w:val="20"/>
+      </w:rPr>
+    </w:lvl>
+    <w:lvl w:ilvl="4" w:tentative="1">
+      <w:start w:val="1"/>
+      <w:numFmt w:val="bullet"/>
+      <w:lvlText w:val=""/>
+      <w:lvlJc w:val="left"/>
+      <w:pPr>
+        <w:tabs>
+          <w:tab w:val="num" w:pos="3600"/>
+        </w:tabs>
+        <w:ind w:left="3600" w:hanging="360"/>
+      </w:pPr>
+      <w:rPr>
+        <w:rFonts w:ascii="Wingdings" w:hAnsi="Wingdings" w:hint="default"/>
+        <w:sz w:val="20"/>
+      </w:rPr>
+    </w:lvl>
+    <w:lvl w:ilvl="5" w:tentative="1">
+      <w:start w:val="1"/>
+      <w:numFmt w:val="bullet"/>
+      <w:lvlText w:val=""/>
+      <w:lvlJc w:val="left"/>
+      <w:pPr>
+        <w:tabs>
+          <w:tab w:val="num" w:pos="4320"/>
+        </w:tabs>
+        <w:ind w:left="4320" w:hanging="360"/>
+      </w:pPr>
+      <w:rPr>
+        <w:rFonts w:ascii="Wingdings" w:hAnsi="Wingdings" w:hint="default"/>
+        <w:sz w:val="20"/>
+      </w:rPr>
+    </w:lvl>
+    <w:lvl w:ilvl="6" w:tentative="1">
+      <w:start w:val="1"/>
+      <w:numFmt w:val="bullet"/>
+      <w:lvlText w:val=""/>
+      <w:lvlJc w:val="left"/>
+      <w:pPr>
+        <w:tabs>
+          <w:tab w:val="num" w:pos="5040"/>
+        </w:tabs>
+        <w:ind w:left="5040" w:hanging="360"/>
+      </w:pPr>
+      <w:rPr>
+        <w:rFonts w:ascii="Wingdings" w:hAnsi="Wingdings" w:hint="default"/>
+        <w:sz w:val="20"/>
+      </w:rPr>
+    </w:lvl>
+    <w:lvl w:ilvl="7" w:tentative="1">
+      <w:start w:val="1"/>
+      <w:numFmt w:val="bullet"/>
+      <w:lvlText w:val=""/>
+      <w:lvlJc w:val="left"/>
+      <w:pPr>
+        <w:tabs>
+          <w:tab w:val="num" w:pos="5760"/>
+        </w:tabs>
+        <w:ind w:left="5760" w:hanging="360"/>
+      </w:pPr>
+      <w:rPr>
+        <w:rFonts w:ascii="Wingdings" w:hAnsi="Wingdings" w:hint="default"/>
+        <w:sz w:val="20"/>
+      </w:rPr>
+    </w:lvl>
+    <w:lvl w:ilvl="8" w:tentative="1">
+      <w:start w:val="1"/>
+      <w:numFmt w:val="bullet"/>
+      <w:lvlText w:val=""/>
+      <w:lvlJc w:val="left"/>
+      <w:pPr>
+        <w:tabs>
+          <w:tab w:val="num" w:pos="6480"/>
+        </w:tabs>
+        <w:ind w:left="6480" w:hanging="360"/>
+      </w:pPr>
+      <w:rPr>
+        <w:rFonts w:ascii="Wingdings" w:hAnsi="Wingdings" w:hint="default"/>
+        <w:sz w:val="20"/>
+      </w:rPr>
+    </w:lvl>
+  </w:abstractNum>
+  <w:abstractNum w:abstractNumId="2" w15:restartNumberingAfterBreak="0">
+    <w:nsid w:val="2E506EF2"/>
+    <w:multiLevelType w:val="multilevel"/>
+    <w:tmpl w:val="06BCB966"/>
+    <w:lvl w:ilvl="0">
+      <w:start w:val="1"/>
+      <w:numFmt w:val="bullet"/>
+      <w:lvlText w:val=""/>
+      <w:lvlJc w:val="left"/>
+      <w:pPr>
+        <w:tabs>
+          <w:tab w:val="num" w:pos="720"/>
+        </w:tabs>
+        <w:ind w:left="720" w:hanging="360"/>
+      </w:pPr>
+      <w:rPr>
+        <w:rFonts w:ascii="Symbol" w:hAnsi="Symbol" w:hint="default"/>
+        <w:sz w:val="20"/>
+      </w:rPr>
+    </w:lvl>
+    <w:lvl w:ilvl="1" w:tentative="1">
+      <w:start w:val="1"/>
+      <w:numFmt w:val="bullet"/>
+      <w:lvlText w:val="o"/>
+      <w:lvlJc w:val="left"/>
+      <w:pPr>
+        <w:tabs>
+          <w:tab w:val="num" w:pos="1440"/>
+        </w:tabs>
+        <w:ind w:left="1440" w:hanging="360"/>
+      </w:pPr>
+      <w:rPr>
+        <w:rFonts w:ascii="Courier New" w:hAnsi="Courier New" w:hint="default"/>
+        <w:sz w:val="20"/>
+      </w:rPr>
+    </w:lvl>
+    <w:lvl w:ilvl="2" w:tentative="1">
+      <w:start w:val="1"/>
+      <w:numFmt w:val="bullet"/>
+      <w:lvlText w:val=""/>
+      <w:lvlJc w:val="left"/>
+      <w:pPr>
+        <w:tabs>
+          <w:tab w:val="num" w:pos="2160"/>
+        </w:tabs>
+        <w:ind w:left="2160" w:hanging="360"/>
+      </w:pPr>
+      <w:rPr>
+        <w:rFonts w:ascii="Wingdings" w:hAnsi="Wingdings" w:hint="default"/>
+        <w:sz w:val="20"/>
+      </w:rPr>
+    </w:lvl>
+    <w:lvl w:ilvl="3" w:tentative="1">
+      <w:start w:val="1"/>
+      <w:numFmt w:val="bullet"/>
+      <w:lvlText w:val=""/>
+      <w:lvlJc w:val="left"/>
+      <w:pPr>
+        <w:tabs>
+          <w:tab w:val="num" w:pos="2880"/>
+        </w:tabs>
+        <w:ind w:left="2880" w:hanging="360"/>
+      </w:pPr>
+      <w:rPr>
+        <w:rFonts w:ascii="Wingdings" w:hAnsi="Wingdings" w:hint="default"/>
+        <w:sz w:val="20"/>
+      </w:rPr>
+    </w:lvl>
+    <w:lvl w:ilvl="4" w:tentative="1">
+      <w:start w:val="1"/>
+      <w:numFmt w:val="bullet"/>
+      <w:lvlText w:val=""/>
+      <w:lvlJc w:val="left"/>
+      <w:pPr>
+        <w:tabs>
+          <w:tab w:val="num" w:pos="3600"/>
+        </w:tabs>
+        <w:ind w:left="3600" w:hanging="360"/>
+      </w:pPr>
+      <w:rPr>
+        <w:rFonts w:ascii="Wingdings" w:hAnsi="Wingdings" w:hint="default"/>
+        <w:sz w:val="20"/>
+      </w:rPr>
+    </w:lvl>
+    <w:lvl w:ilvl="5" w:tentative="1">
+      <w:start w:val="1"/>
+      <w:numFmt w:val="bullet"/>
+      <w:lvlText w:val=""/>
+      <w:lvlJc w:val="left"/>
+      <w:pPr>
+        <w:tabs>
+          <w:tab w:val="num" w:pos="4320"/>
+        </w:tabs>
+        <w:ind w:left="4320" w:hanging="360"/>
+      </w:pPr>
+      <w:rPr>
+        <w:rFonts w:ascii="Wingdings" w:hAnsi="Wingdings" w:hint="default"/>
+        <w:sz w:val="20"/>
+      </w:rPr>
+    </w:lvl>
+    <w:lvl w:ilvl="6" w:tentative="1">
+      <w:start w:val="1"/>
+      <w:numFmt w:val="bullet"/>
+      <w:lvlText w:val=""/>
+      <w:lvlJc w:val="left"/>
+      <w:pPr>
+        <w:tabs>
+          <w:tab w:val="num" w:pos="5040"/>
+        </w:tabs>
+        <w:ind w:left="5040" w:hanging="360"/>
+      </w:pPr>
+      <w:rPr>
+        <w:rFonts w:ascii="Wingdings" w:hAnsi="Wingdings" w:hint="default"/>
+        <w:sz w:val="20"/>
+      </w:rPr>
+    </w:lvl>
+    <w:lvl w:ilvl="7" w:tentative="1">
+      <w:start w:val="1"/>
+      <w:numFmt w:val="bullet"/>
+      <w:lvlText w:val=""/>
+      <w:lvlJc w:val="left"/>
+      <w:pPr>
+        <w:tabs>
+          <w:tab w:val="num" w:pos="5760"/>
+        </w:tabs>
+        <w:ind w:left="5760" w:hanging="360"/>
+      </w:pPr>
+      <w:rPr>
+        <w:rFonts w:ascii="Wingdings" w:hAnsi="Wingdings" w:hint="default"/>
+        <w:sz w:val="20"/>
+      </w:rPr>
+    </w:lvl>
+    <w:lvl w:ilvl="8" w:tentative="1">
+      <w:start w:val="1"/>
+      <w:numFmt w:val="bullet"/>
+      <w:lvlText w:val=""/>
+      <w:lvlJc w:val="left"/>
+      <w:pPr>
+        <w:tabs>
+          <w:tab w:val="num" w:pos="6480"/>
+        </w:tabs>
+        <w:ind w:left="6480" w:hanging="360"/>
+      </w:pPr>
+      <w:rPr>
+        <w:rFonts w:ascii="Wingdings" w:hAnsi="Wingdings" w:hint="default"/>
+        <w:sz w:val="20"/>
+      </w:rPr>
+    </w:lvl>
+  </w:abstractNum>
+  <w:abstractNum w:abstractNumId="3" w15:restartNumberingAfterBreak="0">
+    <w:nsid w:val="480071FF"/>
+    <w:multiLevelType w:val="multilevel"/>
+    <w:tmpl w:val="1EB6B1BA"/>
+    <w:lvl w:ilvl="0">
+      <w:start w:val="1"/>
+      <w:numFmt w:val="bullet"/>
+      <w:lvlText w:val=""/>
+      <w:lvlJc w:val="left"/>
+      <w:pPr>
+        <w:tabs>
+          <w:tab w:val="num" w:pos="720"/>
+        </w:tabs>
+        <w:ind w:left="720" w:hanging="360"/>
+      </w:pPr>
+      <w:rPr>
+        <w:rFonts w:ascii="Symbol" w:hAnsi="Symbol" w:hint="default"/>
+        <w:sz w:val="20"/>
+      </w:rPr>
+    </w:lvl>
+    <w:lvl w:ilvl="1" w:tentative="1">
+      <w:start w:val="1"/>
+      <w:numFmt w:val="bullet"/>
+      <w:lvlText w:val="o"/>
+      <w:lvlJc w:val="left"/>
+      <w:pPr>
+        <w:tabs>
+          <w:tab w:val="num" w:pos="1440"/>
+        </w:tabs>
+        <w:ind w:left="1440" w:hanging="360"/>
+      </w:pPr>
+      <w:rPr>
+        <w:rFonts w:ascii="Courier New" w:hAnsi="Courier New" w:hint="default"/>
+        <w:sz w:val="20"/>
+      </w:rPr>
+    </w:lvl>
+    <w:lvl w:ilvl="2" w:tentative="1">
+      <w:start w:val="1"/>
+      <w:numFmt w:val="bullet"/>
+      <w:lvlText w:val=""/>
+      <w:lvlJc w:val="left"/>
+      <w:pPr>
+        <w:tabs>
+          <w:tab w:val="num" w:pos="2160"/>
+        </w:tabs>
+        <w:ind w:left="2160" w:hanging="360"/>
+      </w:pPr>
+      <w:rPr>
+        <w:rFonts w:ascii="Wingdings" w:hAnsi="Wingdings" w:hint="default"/>
+        <w:sz w:val="20"/>
+      </w:rPr>
+    </w:lvl>
+    <w:lvl w:ilvl="3" w:tentative="1">
+      <w:start w:val="1"/>
+      <w:numFmt w:val="bullet"/>
+      <w:lvlText w:val=""/>
+      <w:lvlJc w:val="left"/>
+      <w:pPr>
+        <w:tabs>
+          <w:tab w:val="num" w:pos="2880"/>
+        </w:tabs>
+        <w:ind w:left="2880" w:hanging="360"/>
+      </w:pPr>
+      <w:rPr>
+        <w:rFonts w:ascii="Wingdings" w:hAnsi="Wingdings" w:hint="default"/>
+        <w:sz w:val="20"/>
+      </w:rPr>
+    </w:lvl>
+    <w:lvl w:ilvl="4" w:tentative="1">
+      <w:start w:val="1"/>
+      <w:numFmt w:val="bullet"/>
+      <w:lvlText w:val=""/>
+      <w:lvlJc w:val="left"/>
+      <w:pPr>
+        <w:tabs>
+          <w:tab w:val="num" w:pos="3600"/>
+        </w:tabs>
+        <w:ind w:left="3600" w:hanging="360"/>
+      </w:pPr>
+      <w:rPr>
+        <w:rFonts w:ascii="Wingdings" w:hAnsi="Wingdings" w:hint="default"/>
+        <w:sz w:val="20"/>
+      </w:rPr>
+    </w:lvl>
+    <w:lvl w:ilvl="5" w:tentative="1">
+      <w:start w:val="1"/>
+      <w:numFmt w:val="bullet"/>
+      <w:lvlText w:val=""/>
+      <w:lvlJc w:val="left"/>
+      <w:pPr>
+        <w:tabs>
+          <w:tab w:val="num" w:pos="4320"/>
+        </w:tabs>
+        <w:ind w:left="4320" w:hanging="360"/>
+      </w:pPr>
+      <w:rPr>
+        <w:rFonts w:ascii="Wingdings" w:hAnsi="Wingdings" w:hint="default"/>
+        <w:sz w:val="20"/>
+      </w:rPr>
+    </w:lvl>
+    <w:lvl w:ilvl="6" w:tentative="1">
+      <w:start w:val="1"/>
+      <w:numFmt w:val="bullet"/>
+      <w:lvlText w:val=""/>
+      <w:lvlJc w:val="left"/>
+      <w:pPr>
+        <w:tabs>
+          <w:tab w:val="num" w:pos="5040"/>
+        </w:tabs>
+        <w:ind w:left="5040" w:hanging="360"/>
+      </w:pPr>
+      <w:rPr>
+        <w:rFonts w:ascii="Wingdings" w:hAnsi="Wingdings" w:hint="default"/>
+        <w:sz w:val="20"/>
+      </w:rPr>
+    </w:lvl>
+    <w:lvl w:ilvl="7" w:tentative="1">
+      <w:start w:val="1"/>
+      <w:numFmt w:val="bullet"/>
+      <w:lvlText w:val=""/>
+      <w:lvlJc w:val="left"/>
+      <w:pPr>
+        <w:tabs>
+          <w:tab w:val="num" w:pos="5760"/>
+        </w:tabs>
+        <w:ind w:left="5760" w:hanging="360"/>
+      </w:pPr>
+      <w:rPr>
+        <w:rFonts w:ascii="Wingdings" w:hAnsi="Wingdings" w:hint="default"/>
+        <w:sz w:val="20"/>
+      </w:rPr>
+    </w:lvl>
+    <w:lvl w:ilvl="8" w:tentative="1">
+      <w:start w:val="1"/>
+      <w:numFmt w:val="bullet"/>
+      <w:lvlText w:val=""/>
+      <w:lvlJc w:val="left"/>
+      <w:pPr>
+        <w:tabs>
+          <w:tab w:val="num" w:pos="6480"/>
+        </w:tabs>
+        <w:ind w:left="6480" w:hanging="360"/>
+      </w:pPr>
+      <w:rPr>
+        <w:rFonts w:ascii="Wingdings" w:hAnsi="Wingdings" w:hint="default"/>
+        <w:sz w:val="20"/>
+      </w:rPr>
+    </w:lvl>
+  </w:abstractNum>
+  <w:abstractNum w:abstractNumId="4" w15:restartNumberingAfterBreak="0">
+    <w:nsid w:val="58F15D70"/>
+    <w:multiLevelType w:val="multilevel"/>
+    <w:tmpl w:val="CFC439A8"/>
+    <w:lvl w:ilvl="0">
+      <w:start w:val="1"/>
+      <w:numFmt w:val="bullet"/>
+      <w:lvlText w:val=""/>
+      <w:lvlJc w:val="left"/>
+      <w:pPr>
+        <w:tabs>
+          <w:tab w:val="num" w:pos="720"/>
+        </w:tabs>
+        <w:ind w:left="720" w:hanging="360"/>
+      </w:pPr>
+      <w:rPr>
+        <w:rFonts w:ascii="Symbol" w:hAnsi="Symbol" w:hint="default"/>
+        <w:sz w:val="20"/>
+      </w:rPr>
+    </w:lvl>
+    <w:lvl w:ilvl="1" w:tentative="1">
+      <w:start w:val="1"/>
+      <w:numFmt w:val="bullet"/>
+      <w:lvlText w:val="o"/>
+      <w:lvlJc w:val="left"/>
+      <w:pPr>
+        <w:tabs>
+          <w:tab w:val="num" w:pos="1440"/>
+        </w:tabs>
+        <w:ind w:left="1440" w:hanging="360"/>
+      </w:pPr>
+      <w:rPr>
+        <w:rFonts w:ascii="Courier New" w:hAnsi="Courier New" w:hint="default"/>
+        <w:sz w:val="20"/>
+      </w:rPr>
+    </w:lvl>
+    <w:lvl w:ilvl="2" w:tentative="1">
+      <w:start w:val="1"/>
+      <w:numFmt w:val="bullet"/>
+      <w:lvlText w:val=""/>
+      <w:lvlJc w:val="left"/>
+      <w:pPr>
+        <w:tabs>
+          <w:tab w:val="num" w:pos="2160"/>
+        </w:tabs>
+        <w:ind w:left="2160" w:hanging="360"/>
+      </w:pPr>
+      <w:rPr>
+        <w:rFonts w:ascii="Wingdings" w:hAnsi="Wingdings" w:hint="default"/>
+        <w:sz w:val="20"/>
+      </w:rPr>
+    </w:lvl>
+    <w:lvl w:ilvl="3" w:tentative="1">
+      <w:start w:val="1"/>
+      <w:numFmt w:val="bullet"/>
+      <w:lvlText w:val=""/>
+      <w:lvlJc w:val="left"/>
+      <w:pPr>
+        <w:tabs>
+          <w:tab w:val="num" w:pos="2880"/>
+        </w:tabs>
+        <w:ind w:left="2880" w:hanging="360"/>
+      </w:pPr>
+      <w:rPr>
+        <w:rFonts w:ascii="Wingdings" w:hAnsi="Wingdings" w:hint="default"/>
+        <w:sz w:val="20"/>
+      </w:rPr>
+    </w:lvl>
+    <w:lvl w:ilvl="4" w:tentative="1">
+      <w:start w:val="1"/>
+      <w:numFmt w:val="bullet"/>
+      <w:lvlText w:val=""/>
+      <w:lvlJc w:val="left"/>
+      <w:pPr>
+        <w:tabs>
+          <w:tab w:val="num" w:pos="3600"/>
+        </w:tabs>
+        <w:ind w:left="3600" w:hanging="360"/>
+      </w:pPr>
+      <w:rPr>
+        <w:rFonts w:ascii="Wingdings" w:hAnsi="Wingdings" w:hint="default"/>
+        <w:sz w:val="20"/>
+      </w:rPr>
+    </w:lvl>
+    <w:lvl w:ilvl="5" w:tentative="1">
+      <w:start w:val="1"/>
+      <w:numFmt w:val="bullet"/>
+      <w:lvlText w:val=""/>
+      <w:lvlJc w:val="left"/>
+      <w:pPr>
+        <w:tabs>
+          <w:tab w:val="num" w:pos="4320"/>
+        </w:tabs>
+        <w:ind w:left="4320" w:hanging="360"/>
+      </w:pPr>
+      <w:rPr>
+        <w:rFonts w:ascii="Wingdings" w:hAnsi="Wingdings" w:hint="default"/>
+        <w:sz w:val="20"/>
+      </w:rPr>
+    </w:lvl>
+    <w:lvl w:ilvl="6" w:tentative="1">
+      <w:start w:val="1"/>
+      <w:numFmt w:val="bullet"/>
+      <w:lvlText w:val=""/>
+      <w:lvlJc w:val="left"/>
+      <w:pPr>
+        <w:tabs>
+          <w:tab w:val="num" w:pos="5040"/>
+        </w:tabs>
+        <w:ind w:left="5040" w:hanging="360"/>
+      </w:pPr>
+      <w:rPr>
+        <w:rFonts w:ascii="Wingdings" w:hAnsi="Wingdings" w:hint="default"/>
+        <w:sz w:val="20"/>
+      </w:rPr>
+    </w:lvl>
+    <w:lvl w:ilvl="7" w:tentative="1">
+      <w:start w:val="1"/>
+      <w:numFmt w:val="bullet"/>
+      <w:lvlText w:val=""/>
+      <w:lvlJc w:val="left"/>
+      <w:pPr>
+        <w:tabs>
+          <w:tab w:val="num" w:pos="5760"/>
+        </w:tabs>
+        <w:ind w:left="5760" w:hanging="360"/>
+      </w:pPr>
+      <w:rPr>
+        <w:rFonts w:ascii="Wingdings" w:hAnsi="Wingdings" w:hint="default"/>
+        <w:sz w:val="20"/>
+      </w:rPr>
+    </w:lvl>
+    <w:lvl w:ilvl="8" w:tentative="1">
+      <w:start w:val="1"/>
+      <w:numFmt w:val="bullet"/>
+      <w:lvlText w:val=""/>
+      <w:lvlJc w:val="left"/>
+      <w:pPr>
+        <w:tabs>
+          <w:tab w:val="num" w:pos="6480"/>
+        </w:tabs>
+        <w:ind w:left="6480" w:hanging="360"/>
+      </w:pPr>
+      <w:rPr>
+        <w:rFonts w:ascii="Wingdings" w:hAnsi="Wingdings" w:hint="default"/>
+        <w:sz w:val="20"/>
+      </w:rPr>
+    </w:lvl>
+  </w:abstractNum>
+  <w:abstractNum w:abstractNumId="5" w15:restartNumberingAfterBreak="0">
+    <w:nsid w:val="5DB956F3"/>
+    <w:multiLevelType w:val="multilevel"/>
+    <w:tmpl w:val="E30A7E08"/>
+    <w:lvl w:ilvl="0">
+      <w:start w:val="1"/>
+      <w:numFmt w:val="bullet"/>
+      <w:lvlText w:val=""/>
+      <w:lvlJc w:val="left"/>
+      <w:pPr>
+        <w:tabs>
+          <w:tab w:val="num" w:pos="720"/>
+        </w:tabs>
+        <w:ind w:left="720" w:hanging="360"/>
+      </w:pPr>
+      <w:rPr>
+        <w:rFonts w:ascii="Symbol" w:hAnsi="Symbol" w:hint="default"/>
+        <w:sz w:val="20"/>
+      </w:rPr>
+    </w:lvl>
+    <w:lvl w:ilvl="1" w:tentative="1">
+      <w:start w:val="1"/>
+      <w:numFmt w:val="bullet"/>
+      <w:lvlText w:val="o"/>
+      <w:lvlJc w:val="left"/>
+      <w:pPr>
+        <w:tabs>
+          <w:tab w:val="num" w:pos="1440"/>
+        </w:tabs>
+        <w:ind w:left="1440" w:hanging="360"/>
+      </w:pPr>
+      <w:rPr>
+        <w:rFonts w:ascii="Courier New" w:hAnsi="Courier New" w:hint="default"/>
+        <w:sz w:val="20"/>
+      </w:rPr>
+    </w:lvl>
+    <w:lvl w:ilvl="2" w:tentative="1">
+      <w:start w:val="1"/>
+      <w:numFmt w:val="bullet"/>
+      <w:lvlText w:val=""/>
+      <w:lvlJc w:val="left"/>
+      <w:pPr>
+        <w:tabs>
+          <w:tab w:val="num" w:pos="2160"/>
+        </w:tabs>
+        <w:ind w:left="2160" w:hanging="360"/>
+      </w:pPr>
+      <w:rPr>
+        <w:rFonts w:ascii="Wingdings" w:hAnsi="Wingdings" w:hint="default"/>
+        <w:sz w:val="20"/>
+      </w:rPr>
+    </w:lvl>
+    <w:lvl w:ilvl="3" w:tentative="1">
+      <w:start w:val="1"/>
+      <w:numFmt w:val="bullet"/>
+      <w:lvlText w:val=""/>
+      <w:lvlJc w:val="left"/>
+      <w:pPr>
+        <w:tabs>
+          <w:tab w:val="num" w:pos="2880"/>
+        </w:tabs>
+        <w:ind w:left="2880" w:hanging="360"/>
+      </w:pPr>
+      <w:rPr>
+        <w:rFonts w:ascii="Wingdings" w:hAnsi="Wingdings" w:hint="default"/>
+        <w:sz w:val="20"/>
+      </w:rPr>
+    </w:lvl>
+    <w:lvl w:ilvl="4" w:tentative="1">
+      <w:start w:val="1"/>
+      <w:numFmt w:val="bullet"/>
+      <w:lvlText w:val=""/>
+      <w:lvlJc w:val="left"/>
+      <w:pPr>
+        <w:tabs>
+          <w:tab w:val="num" w:pos="3600"/>
+        </w:tabs>
+        <w:ind w:left="3600" w:hanging="360"/>
+      </w:pPr>
+      <w:rPr>
+        <w:rFonts w:ascii="Wingdings" w:hAnsi="Wingdings" w:hint="default"/>
+        <w:sz w:val="20"/>
+      </w:rPr>
+    </w:lvl>
+    <w:lvl w:ilvl="5" w:tentative="1">
+      <w:start w:val="1"/>
+      <w:numFmt w:val="bullet"/>
+      <w:lvlText w:val=""/>
+      <w:lvlJc w:val="left"/>
+      <w:pPr>
+        <w:tabs>
+          <w:tab w:val="num" w:pos="4320"/>
+        </w:tabs>
+        <w:ind w:left="4320" w:hanging="360"/>
+      </w:pPr>
+      <w:rPr>
+        <w:rFonts w:ascii="Wingdings" w:hAnsi="Wingdings" w:hint="default"/>
+        <w:sz w:val="20"/>
+      </w:rPr>
+    </w:lvl>
+    <w:lvl w:ilvl="6" w:tentative="1">
+      <w:start w:val="1"/>
+      <w:numFmt w:val="bullet"/>
+      <w:lvlText w:val=""/>
+      <w:lvlJc w:val="left"/>
+      <w:pPr>
+        <w:tabs>
+          <w:tab w:val="num" w:pos="5040"/>
+        </w:tabs>
+        <w:ind w:left="5040" w:hanging="360"/>
+      </w:pPr>
+      <w:rPr>
+        <w:rFonts w:ascii="Wingdings" w:hAnsi="Wingdings" w:hint="default"/>
+        <w:sz w:val="20"/>
+      </w:rPr>
+    </w:lvl>
+    <w:lvl w:ilvl="7" w:tentative="1">
+      <w:start w:val="1"/>
+      <w:numFmt w:val="bullet"/>
+      <w:lvlText w:val=""/>
+      <w:lvlJc w:val="left"/>
+      <w:pPr>
+        <w:tabs>
+          <w:tab w:val="num" w:pos="5760"/>
+        </w:tabs>
+        <w:ind w:left="5760" w:hanging="360"/>
+      </w:pPr>
+      <w:rPr>
+        <w:rFonts w:ascii="Wingdings" w:hAnsi="Wingdings" w:hint="default"/>
+        <w:sz w:val="20"/>
+      </w:rPr>
+    </w:lvl>
+    <w:lvl w:ilvl="8" w:tentative="1">
+      <w:start w:val="1"/>
+      <w:numFmt w:val="bullet"/>
+      <w:lvlText w:val=""/>
+      <w:lvlJc w:val="left"/>
+      <w:pPr>
+        <w:tabs>
+          <w:tab w:val="num" w:pos="6480"/>
+        </w:tabs>
+        <w:ind w:left="6480" w:hanging="360"/>
+      </w:pPr>
+      <w:rPr>
+        <w:rFonts w:ascii="Wingdings" w:hAnsi="Wingdings" w:hint="default"/>
+        <w:sz w:val="20"/>
+      </w:rPr>
+    </w:lvl>
+  </w:abstractNum>
+  <w:abstractNum w:abstractNumId="6" w15:restartNumberingAfterBreak="0">
+    <w:nsid w:val="638D6E2A"/>
+    <w:multiLevelType w:val="multilevel"/>
+    <w:tmpl w:val="467EB148"/>
+    <w:lvl w:ilvl="0">
+      <w:start w:val="1"/>
+      <w:numFmt w:val="bullet"/>
+      <w:lvlText w:val=""/>
+      <w:lvlJc w:val="left"/>
+      <w:pPr>
+        <w:tabs>
+          <w:tab w:val="num" w:pos="720"/>
+        </w:tabs>
+        <w:ind w:left="720" w:hanging="360"/>
+      </w:pPr>
+      <w:rPr>
+        <w:rFonts w:ascii="Symbol" w:hAnsi="Symbol" w:hint="default"/>
+        <w:sz w:val="20"/>
+      </w:rPr>
+    </w:lvl>
+    <w:lvl w:ilvl="1" w:tentative="1">
+      <w:start w:val="1"/>
+      <w:numFmt w:val="bullet"/>
+      <w:lvlText w:val="o"/>
+      <w:lvlJc w:val="left"/>
+      <w:pPr>
+        <w:tabs>
+          <w:tab w:val="num" w:pos="1440"/>
+        </w:tabs>
+        <w:ind w:left="1440" w:hanging="360"/>
+      </w:pPr>
+      <w:rPr>
+        <w:rFonts w:ascii="Courier New" w:hAnsi="Courier New" w:hint="default"/>
+        <w:sz w:val="20"/>
+      </w:rPr>
+    </w:lvl>
+    <w:lvl w:ilvl="2" w:tentative="1">
+      <w:start w:val="1"/>
+      <w:numFmt w:val="bullet"/>
+      <w:lvlText w:val=""/>
+      <w:lvlJc w:val="left"/>
+      <w:pPr>
+        <w:tabs>
+          <w:tab w:val="num" w:pos="2160"/>
+        </w:tabs>
+        <w:ind w:left="2160" w:hanging="360"/>
+      </w:pPr>
+      <w:rPr>
+        <w:rFonts w:ascii="Wingdings" w:hAnsi="Wingdings" w:hint="default"/>
+        <w:sz w:val="20"/>
+      </w:rPr>
+    </w:lvl>
+    <w:lvl w:ilvl="3" w:tentative="1">
+      <w:start w:val="1"/>
+      <w:numFmt w:val="bullet"/>
+      <w:lvlText w:val=""/>
+      <w:lvlJc w:val="left"/>
+      <w:pPr>
+        <w:tabs>
+          <w:tab w:val="num" w:pos="2880"/>
+        </w:tabs>
+        <w:ind w:left="2880" w:hanging="360"/>
+      </w:pPr>
+      <w:rPr>
+        <w:rFonts w:ascii="Wingdings" w:hAnsi="Wingdings" w:hint="default"/>
+        <w:sz w:val="20"/>
+      </w:rPr>
+    </w:lvl>
+    <w:lvl w:ilvl="4" w:tentative="1">
+      <w:start w:val="1"/>
+      <w:numFmt w:val="bullet"/>
+      <w:lvlText w:val=""/>
+      <w:lvlJc w:val="left"/>
+      <w:pPr>
+        <w:tabs>
+          <w:tab w:val="num" w:pos="3600"/>
+        </w:tabs>
+        <w:ind w:left="3600" w:hanging="360"/>
+      </w:pPr>
+      <w:rPr>
+        <w:rFonts w:ascii="Wingdings" w:hAnsi="Wingdings" w:hint="default"/>
+        <w:sz w:val="20"/>
+      </w:rPr>
+    </w:lvl>
+    <w:lvl w:ilvl="5" w:tentative="1">
+      <w:start w:val="1"/>
+      <w:numFmt w:val="bullet"/>
+      <w:lvlText w:val=""/>
+      <w:lvlJc w:val="left"/>
+      <w:pPr>
+        <w:tabs>
+          <w:tab w:val="num" w:pos="4320"/>
+        </w:tabs>
+        <w:ind w:left="4320" w:hanging="360"/>
+      </w:pPr>
+      <w:rPr>
+        <w:rFonts w:ascii="Wingdings" w:hAnsi="Wingdings" w:hint="default"/>
+        <w:sz w:val="20"/>
+      </w:rPr>
+    </w:lvl>
+    <w:lvl w:ilvl="6" w:tentative="1">
+      <w:start w:val="1"/>
+      <w:numFmt w:val="bullet"/>
+      <w:lvlText w:val=""/>
+      <w:lvlJc w:val="left"/>
+      <w:pPr>
+        <w:tabs>
+          <w:tab w:val="num" w:pos="5040"/>
+        </w:tabs>
+        <w:ind w:left="5040" w:hanging="360"/>
+      </w:pPr>
+      <w:rPr>
+        <w:rFonts w:ascii="Wingdings" w:hAnsi="Wingdings" w:hint="default"/>
+        <w:sz w:val="20"/>
+      </w:rPr>
+    </w:lvl>
+    <w:lvl w:ilvl="7" w:tentative="1">
+      <w:start w:val="1"/>
+      <w:numFmt w:val="bullet"/>
+      <w:lvlText w:val=""/>
+      <w:lvlJc w:val="left"/>
+      <w:pPr>
+        <w:tabs>
+          <w:tab w:val="num" w:pos="5760"/>
+        </w:tabs>
+        <w:ind w:left="5760" w:hanging="360"/>
+      </w:pPr>
+      <w:rPr>
+        <w:rFonts w:ascii="Wingdings" w:hAnsi="Wingdings" w:hint="default"/>
+        <w:sz w:val="20"/>
+      </w:rPr>
+    </w:lvl>
+    <w:lvl w:ilvl="8" w:tentative="1">
+      <w:start w:val="1"/>
+      <w:numFmt w:val="bullet"/>
+      <w:lvlText w:val=""/>
+      <w:lvlJc w:val="left"/>
+      <w:pPr>
+        <w:tabs>
+          <w:tab w:val="num" w:pos="6480"/>
+        </w:tabs>
+        <w:ind w:left="6480" w:hanging="360"/>
+      </w:pPr>
+      <w:rPr>
+        <w:rFonts w:ascii="Wingdings" w:hAnsi="Wingdings" w:hint="default"/>
+        <w:sz w:val="20"/>
+      </w:rPr>
+    </w:lvl>
+  </w:abstractNum>
+  <w:num w:numId="1">
+    <w:abstractNumId w:val="6"/>
+  </w:num>
+  <w:num w:numId="2">
+    <w:abstractNumId w:val="5"/>
+  </w:num>
+  <w:num w:numId="3">
+    <w:abstractNumId w:val="3"/>
+  </w:num>
+  <w:num w:numId="4">
+    <w:abstractNumId w:val="4"/>
+  </w:num>
+  <w:num w:numId="5">
+    <w:abstractNumId w:val="2"/>
+  </w:num>
+  <w:num w:numId="6">
+    <w:abstractNumId w:val="0"/>
+  </w:num>
+  <w:num w:numId="7">
+    <w:abstractNumId w:val="1"/>
+  </w:num>
+</w:numbering>
 </file>
 
 <file path=word/styles.xml><?xml version="1.0" encoding="utf-8"?>
@@ -985,6 +4378,67 @@
     <w:name w:val="Normal"/>
     <w:qFormat/>
   </w:style>
+  <w:style w:type="paragraph" w:styleId="Ttulo1">
+    <w:name w:val="heading 1"/>
+    <w:basedOn w:val="Normal"/>
+    <w:next w:val="Normal"/>
+    <w:link w:val="Ttulo1Car"/>
+    <w:uiPriority w:val="9"/>
+    <w:qFormat/>
+    <w:rsid w:val="00FC056E"/>
+    <w:pPr>
+      <w:keepNext/>
+      <w:keepLines/>
+      <w:spacing w:before="240" w:after="0"/>
+      <w:outlineLvl w:val="0"/>
+    </w:pPr>
+    <w:rPr>
+      <w:rFonts w:asciiTheme="majorHAnsi" w:eastAsiaTheme="majorEastAsia" w:hAnsiTheme="majorHAnsi" w:cstheme="majorBidi"/>
+      <w:color w:val="2F5496" w:themeColor="accent1" w:themeShade="BF"/>
+      <w:sz w:val="32"/>
+      <w:szCs w:val="32"/>
+    </w:rPr>
+  </w:style>
+  <w:style w:type="paragraph" w:styleId="Ttulo2">
+    <w:name w:val="heading 2"/>
+    <w:basedOn w:val="Normal"/>
+    <w:link w:val="Ttulo2Car"/>
+    <w:uiPriority w:val="9"/>
+    <w:qFormat/>
+    <w:rsid w:val="00216552"/>
+    <w:pPr>
+      <w:spacing w:before="100" w:beforeAutospacing="1" w:after="100" w:afterAutospacing="1" w:line="240" w:lineRule="auto"/>
+      <w:outlineLvl w:val="1"/>
+    </w:pPr>
+    <w:rPr>
+      <w:rFonts w:ascii="Times New Roman" w:eastAsia="Times New Roman" w:hAnsi="Times New Roman" w:cs="Times New Roman"/>
+      <w:b/>
+      <w:bCs/>
+      <w:sz w:val="36"/>
+      <w:szCs w:val="36"/>
+      <w:lang w:eastAsia="es-EC"/>
+    </w:rPr>
+  </w:style>
+  <w:style w:type="paragraph" w:styleId="Ttulo3">
+    <w:name w:val="heading 3"/>
+    <w:basedOn w:val="Normal"/>
+    <w:link w:val="Ttulo3Car"/>
+    <w:uiPriority w:val="9"/>
+    <w:qFormat/>
+    <w:rsid w:val="00216552"/>
+    <w:pPr>
+      <w:spacing w:before="100" w:beforeAutospacing="1" w:after="100" w:afterAutospacing="1" w:line="240" w:lineRule="auto"/>
+      <w:outlineLvl w:val="2"/>
+    </w:pPr>
+    <w:rPr>
+      <w:rFonts w:ascii="Times New Roman" w:eastAsia="Times New Roman" w:hAnsi="Times New Roman" w:cs="Times New Roman"/>
+      <w:b/>
+      <w:bCs/>
+      <w:sz w:val="27"/>
+      <w:szCs w:val="27"/>
+      <w:lang w:eastAsia="es-EC"/>
+    </w:rPr>
+  </w:style>
   <w:style w:type="character" w:default="1" w:styleId="Fuentedeprrafopredeter">
     <w:name w:val="Default Paragraph Font"/>
     <w:uiPriority w:val="1"/>
@@ -1094,6 +4548,102 @@
     <w:rPr>
       <w:color w:val="0563C1" w:themeColor="hyperlink"/>
       <w:u w:val="single"/>
+    </w:rPr>
+  </w:style>
+  <w:style w:type="character" w:customStyle="1" w:styleId="Ttulo2Car">
+    <w:name w:val="Título 2 Car"/>
+    <w:basedOn w:val="Fuentedeprrafopredeter"/>
+    <w:link w:val="Ttulo2"/>
+    <w:uiPriority w:val="9"/>
+    <w:rsid w:val="00216552"/>
+    <w:rPr>
+      <w:rFonts w:ascii="Times New Roman" w:eastAsia="Times New Roman" w:hAnsi="Times New Roman" w:cs="Times New Roman"/>
+      <w:b/>
+      <w:bCs/>
+      <w:sz w:val="36"/>
+      <w:szCs w:val="36"/>
+      <w:lang w:eastAsia="es-EC"/>
+    </w:rPr>
+  </w:style>
+  <w:style w:type="character" w:customStyle="1" w:styleId="Ttulo3Car">
+    <w:name w:val="Título 3 Car"/>
+    <w:basedOn w:val="Fuentedeprrafopredeter"/>
+    <w:link w:val="Ttulo3"/>
+    <w:uiPriority w:val="9"/>
+    <w:rsid w:val="00216552"/>
+    <w:rPr>
+      <w:rFonts w:ascii="Times New Roman" w:eastAsia="Times New Roman" w:hAnsi="Times New Roman" w:cs="Times New Roman"/>
+      <w:b/>
+      <w:bCs/>
+      <w:sz w:val="27"/>
+      <w:szCs w:val="27"/>
+      <w:lang w:eastAsia="es-EC"/>
+    </w:rPr>
+  </w:style>
+  <w:style w:type="character" w:customStyle="1" w:styleId="Ttulo1Car">
+    <w:name w:val="Título 1 Car"/>
+    <w:basedOn w:val="Fuentedeprrafopredeter"/>
+    <w:link w:val="Ttulo1"/>
+    <w:uiPriority w:val="9"/>
+    <w:rsid w:val="00FC056E"/>
+    <w:rPr>
+      <w:rFonts w:asciiTheme="majorHAnsi" w:eastAsiaTheme="majorEastAsia" w:hAnsiTheme="majorHAnsi" w:cstheme="majorBidi"/>
+      <w:color w:val="2F5496" w:themeColor="accent1" w:themeShade="BF"/>
+      <w:sz w:val="32"/>
+      <w:szCs w:val="32"/>
+    </w:rPr>
+  </w:style>
+  <w:style w:type="paragraph" w:styleId="TtuloTDC">
+    <w:name w:val="TOC Heading"/>
+    <w:basedOn w:val="Ttulo1"/>
+    <w:next w:val="Normal"/>
+    <w:uiPriority w:val="39"/>
+    <w:unhideWhenUsed/>
+    <w:qFormat/>
+    <w:rsid w:val="00FC056E"/>
+    <w:pPr>
+      <w:outlineLvl w:val="9"/>
+    </w:pPr>
+    <w:rPr>
+      <w:lang w:eastAsia="es-EC"/>
+    </w:rPr>
+  </w:style>
+  <w:style w:type="paragraph" w:styleId="TDC2">
+    <w:name w:val="toc 2"/>
+    <w:basedOn w:val="Normal"/>
+    <w:next w:val="Normal"/>
+    <w:autoRedefine/>
+    <w:uiPriority w:val="39"/>
+    <w:unhideWhenUsed/>
+    <w:rsid w:val="00FC056E"/>
+    <w:pPr>
+      <w:spacing w:after="100"/>
+      <w:ind w:left="220"/>
+    </w:pPr>
+  </w:style>
+  <w:style w:type="paragraph" w:styleId="TDC3">
+    <w:name w:val="toc 3"/>
+    <w:basedOn w:val="Normal"/>
+    <w:next w:val="Normal"/>
+    <w:autoRedefine/>
+    <w:uiPriority w:val="39"/>
+    <w:unhideWhenUsed/>
+    <w:rsid w:val="00FC056E"/>
+    <w:pPr>
+      <w:spacing w:after="100"/>
+      <w:ind w:left="440"/>
+    </w:pPr>
+  </w:style>
+  <w:style w:type="character" w:styleId="Mencinsinresolver">
+    <w:name w:val="Unresolved Mention"/>
+    <w:basedOn w:val="Fuentedeprrafopredeter"/>
+    <w:uiPriority w:val="99"/>
+    <w:semiHidden/>
+    <w:unhideWhenUsed/>
+    <w:rsid w:val="00006CE0"/>
+    <w:rPr>
+      <w:color w:val="605E5C"/>
+      <w:shd w:val="clear" w:color="auto" w:fill="E1DFDD"/>
     </w:rPr>
   </w:style>
 </w:styles>
@@ -1358,4 +4908,16 @@
     </a:ext>
   </a:extLst>
 </a:theme>
+</file>
+
+<file path=customXml/item1.xml><?xml version="1.0" encoding="utf-8"?>
+<b:Sources xmlns:b="http://schemas.openxmlformats.org/officeDocument/2006/bibliography" xmlns="http://schemas.openxmlformats.org/officeDocument/2006/bibliography" SelectedStyle="\APASixthEditionOfficeOnline.xsl" StyleName="APA" Version="6"/>
+</file>
+
+<file path=customXml/itemProps1.xml><?xml version="1.0" encoding="utf-8"?>
+<ds:datastoreItem xmlns:ds="http://schemas.openxmlformats.org/officeDocument/2006/customXml" ds:itemID="{D2AD6BB1-68C6-4D3E-9D75-D120113987CD}">
+  <ds:schemaRefs>
+    <ds:schemaRef ds:uri="http://schemas.openxmlformats.org/officeDocument/2006/bibliography"/>
+  </ds:schemaRefs>
+</ds:datastoreItem>
 </file>
</xml_diff>